<commit_message>
fixing spelling of vulnerability
</commit_message>
<xml_diff>
--- a/Data/mansucript/Draft.docx
+++ b/Data/mansucript/Draft.docx
@@ -46,6 +46,15 @@
       <w:r>
         <w:t>Journal of Urban Health</w:t>
       </w:r>
+      <w:r>
+        <w:t xml:space="preserve"> (need to check with Ana first</w:t>
+      </w:r>
+      <w:r>
+        <w:t xml:space="preserve"> if it is of interest</w:t>
+      </w:r>
+      <w:r>
+        <w:t>)</w:t>
+      </w:r>
     </w:p>
     <w:p>
       <w:pPr>
@@ -54,99 +63,14 @@
           <w:bCs/>
         </w:rPr>
       </w:pPr>
-    </w:p>
-    <w:p>
-      <w:pPr>
-        <w:rPr>
-          <w:b/>
-          <w:bCs/>
-        </w:rPr>
-      </w:pPr>
-      <w:r>
-        <w:rPr>
-          <w:b/>
-          <w:bCs/>
-        </w:rPr>
-        <w:t>Introduction</w:t>
-      </w:r>
-    </w:p>
-    <w:p>
-      <w:r>
-        <w:t xml:space="preserve">The use of geopolitical units in public health has increased in recent years. There have been several studies reported investigating health metrics by US congressional districts </w:t>
-      </w:r>
-      <w:r>
-        <w:t xml:space="preserve">– for example, reporting COVID-19 disparities (CITE), cancer mortality (CITE)…. There are also numerous dashboards including for XX, XX, and XX. There have also been several studies reporting on the methods for estimating public health metrics by district as most public health data are not commonly available using district boundaries. The motivation for these studies </w:t>
-      </w:r>
-      <w:proofErr w:type="gramStart"/>
-      <w:r>
-        <w:t>are</w:t>
-      </w:r>
-      <w:proofErr w:type="gramEnd"/>
-      <w:r>
-        <w:t xml:space="preserve"> both to provide elected officials with data for the districts they represent</w:t>
-      </w:r>
-      <w:r>
-        <w:t xml:space="preserve">, </w:t>
-      </w:r>
-      <w:r>
-        <w:t xml:space="preserve">as well as to provide residents with data on the health of their own districts and city.  </w:t>
-      </w:r>
-    </w:p>
-    <w:p/>
-    <w:p>
-      <w:r>
-        <w:t>Almost all studies</w:t>
-      </w:r>
-      <w:r>
-        <w:t xml:space="preserve"> using geopolitical districts</w:t>
-      </w:r>
-      <w:r>
-        <w:t xml:space="preserve"> have been conducted using US congressional districts, with X number of studies using state districts. However, to our knowledge no studies have been published reporting health metrics using city council district boundaries. It is important to understand the jurisdiction and influence that each level of government can have. City council districts are important as council members have control over policies and resources affecting the health and lives of their constituents. In Philadelphia, there are ten City Council districts, each represented by a single councilor.  The City council is comprised of these ten City Councilors and 7 at large members, who all serve X year terms. </w:t>
-      </w:r>
-    </w:p>
-    <w:p>
-      <w:r>
-        <w:t>To both understand the health status and existing inequities in Philadelphia and to better inform city council members as well as their constituents, we created a dashboard that displays health and related metrics by council district. In this paper, we investigate and present two health metrics</w:t>
-      </w:r>
-      <w:r>
-        <w:t xml:space="preserve"> from the dashboard</w:t>
-      </w:r>
-      <w:r>
-        <w:t xml:space="preserve">, tree canopy coverage and health uninsurance, and assess their magnitude and distribution across the city. </w:t>
-      </w:r>
-    </w:p>
-    <w:p>
-      <w:pPr>
-        <w:rPr>
-          <w:b/>
-          <w:bCs/>
-        </w:rPr>
-      </w:pPr>
-      <w:r>
-        <w:rPr>
-          <w:b/>
-          <w:bCs/>
-        </w:rPr>
-        <w:t xml:space="preserve">Dashboard: </w:t>
-      </w:r>
       <w:hyperlink r:id="rId4" w:history="1">
         <w:r>
           <w:rPr>
             <w:rStyle w:val="Hyperlink"/>
+            <w:b/>
+            <w:bCs/>
           </w:rPr>
-          <w:t>https://drexel-uhc.github.io/philadelphia-council-</w:t>
-        </w:r>
-        <w:r>
-          <w:rPr>
-            <w:rStyle w:val="Hyperlink"/>
-          </w:rPr>
-          <w:t>d</w:t>
-        </w:r>
-        <w:r>
-          <w:rPr>
-            <w:rStyle w:val="Hyperlink"/>
-          </w:rPr>
-          <w:t>istricts-and-health/?metric=hs_grad_pct</w:t>
+          <w:t>https://ajph.aphapublications.org/doi/10.2105/AJPH.2021.306708</w:t>
         </w:r>
       </w:hyperlink>
       <w:r>
@@ -154,31 +78,577 @@
           <w:b/>
           <w:bCs/>
         </w:rPr>
-        <w:t xml:space="preserve"> </w:t>
+        <w:t xml:space="preserve"> (reference)</w:t>
       </w:r>
     </w:p>
     <w:p>
-      <w:r>
-        <w:t xml:space="preserve">Other articles using council districts: </w:t>
+      <w:pPr>
+        <w:rPr>
+          <w:b/>
+          <w:bCs/>
+        </w:rPr>
+      </w:pPr>
+      <w:r>
+        <w:rPr>
+          <w:b/>
+          <w:bCs/>
+        </w:rPr>
+        <w:t>Introduction</w:t>
+      </w:r>
+    </w:p>
+    <w:p>
+      <w:r>
+        <w:t xml:space="preserve">Public health has increasingly </w:t>
+      </w:r>
+      <w:r>
+        <w:t>utilized</w:t>
+      </w:r>
+      <w:r>
+        <w:t xml:space="preserve"> geopolitical units</w:t>
+      </w:r>
+      <w:r>
+        <w:t>, or units with geographic and political meaning,</w:t>
+      </w:r>
+      <w:r>
+        <w:t xml:space="preserve"> for research and monitoring</w:t>
+      </w:r>
+      <w:r>
+        <w:t xml:space="preserve"> in recent years</w:t>
+      </w:r>
+      <w:r>
+        <w:t xml:space="preserve"> (cite)</w:t>
+      </w:r>
+      <w:r>
+        <w:t xml:space="preserve">.  </w:t>
+      </w:r>
+      <w:r>
+        <w:t>S</w:t>
+      </w:r>
+      <w:r>
+        <w:t xml:space="preserve">tudies </w:t>
+      </w:r>
+      <w:r>
+        <w:t xml:space="preserve">have </w:t>
+      </w:r>
+      <w:r>
+        <w:t>investigat</w:t>
+      </w:r>
+      <w:r>
+        <w:t>ed</w:t>
+      </w:r>
+      <w:r>
+        <w:t xml:space="preserve"> health </w:t>
+      </w:r>
+      <w:r>
+        <w:t>disparities</w:t>
+      </w:r>
+      <w:r>
+        <w:t xml:space="preserve"> by US congressional districts </w:t>
+      </w:r>
+      <w:r>
+        <w:t xml:space="preserve">– for example, reporting </w:t>
+      </w:r>
+      <w:r>
+        <w:t>opioid prescribing rates</w:t>
+      </w:r>
+      <w:r>
+        <w:t xml:space="preserve"> (</w:t>
       </w:r>
       <w:hyperlink r:id="rId5" w:history="1">
         <w:r>
           <w:rPr>
             <w:rStyle w:val="Hyperlink"/>
           </w:rPr>
-          <w:t>http://www.rvadirt.com/s/RVA-Health-Inequality</w:t>
+          <w:t>https://pmc.ncbi.nlm.nih.gov/articles/PMC6085036/</w:t>
         </w:r>
+      </w:hyperlink>
+      <w:r>
+        <w:t>)</w:t>
+      </w:r>
+      <w:r>
+        <w:t xml:space="preserve"> and</w:t>
+      </w:r>
+      <w:r>
+        <w:t xml:space="preserve"> </w:t>
+      </w:r>
+      <w:r>
+        <w:t>cancer mortality (</w:t>
+      </w:r>
+      <w:hyperlink r:id="rId6" w:history="1">
         <w:r>
           <w:rPr>
             <w:rStyle w:val="Hyperlink"/>
           </w:rPr>
-          <w:t>-</w:t>
+          <w:t>https://pubmed.ncbi.nlm.nih.gov/37159301/</w:t>
         </w:r>
+      </w:hyperlink>
+      <w:r>
+        <w:t>)</w:t>
+      </w:r>
+      <w:r>
+        <w:t xml:space="preserve"> </w:t>
+      </w:r>
+      <w:r>
+        <w:t xml:space="preserve">as well as in </w:t>
+      </w:r>
+      <w:r>
+        <w:t xml:space="preserve">numerous </w:t>
+      </w:r>
+      <w:r>
+        <w:t xml:space="preserve">public facing </w:t>
+      </w:r>
+      <w:r>
+        <w:t>dashboards</w:t>
+      </w:r>
+      <w:r>
+        <w:t>,</w:t>
+      </w:r>
+      <w:r>
+        <w:t xml:space="preserve"> including for </w:t>
+      </w:r>
+      <w:r>
+        <w:t>covid-19 (</w:t>
+      </w:r>
+      <w:hyperlink r:id="rId7" w:history="1">
         <w:r>
           <w:rPr>
             <w:rStyle w:val="Hyperlink"/>
           </w:rPr>
-          <w:t>by-District.pdf</w:t>
+          <w:t>https://gis.harvard.edu/covid-19-across-united-states-congressional-districts</w:t>
+        </w:r>
+      </w:hyperlink>
+      <w:r>
+        <w:t xml:space="preserve">) </w:t>
+      </w:r>
+      <w:r>
+        <w:t>and for comprehensive health determinants and outcomes (</w:t>
+      </w:r>
+      <w:hyperlink r:id="rId8" w:history="1">
+        <w:r>
+          <w:rPr>
+            <w:rStyle w:val="Hyperlink"/>
+          </w:rPr>
+          <w:t>https://www.congressionaldistricthealthdashboard.org/</w:t>
+        </w:r>
+      </w:hyperlink>
+      <w:r>
+        <w:t>)</w:t>
+      </w:r>
+      <w:r>
+        <w:t>.</w:t>
+      </w:r>
+      <w:r>
+        <w:t xml:space="preserve"> </w:t>
+      </w:r>
+      <w:r>
+        <w:t xml:space="preserve">There have also been several studies </w:t>
+      </w:r>
+      <w:r>
+        <w:t>describing</w:t>
+      </w:r>
+      <w:r>
+        <w:t xml:space="preserve"> the methods for estimating public health metrics by district</w:t>
+      </w:r>
+      <w:r>
+        <w:t>,</w:t>
+      </w:r>
+      <w:r>
+        <w:t xml:space="preserve"> as most public health data are not commonly available using district boundaries</w:t>
+      </w:r>
+      <w:r>
+        <w:t xml:space="preserve"> (</w:t>
+      </w:r>
+      <w:hyperlink r:id="rId9" w:history="1">
+        <w:r>
+          <w:rPr>
+            <w:rStyle w:val="Hyperlink"/>
+          </w:rPr>
+          <w:t>https://academic.oup.com/aje/article/193/7/1040/7614342</w:t>
+        </w:r>
+      </w:hyperlink>
+      <w:r>
+        <w:t xml:space="preserve"> , </w:t>
+      </w:r>
+      <w:hyperlink r:id="rId10" w:history="1">
+        <w:r>
+          <w:rPr>
+            <w:rStyle w:val="Hyperlink"/>
+          </w:rPr>
+          <w:t>https://www.sciencedirect.com/science/article/pii/S2352827323001763</w:t>
+        </w:r>
+      </w:hyperlink>
+      <w:r>
+        <w:t xml:space="preserve"> and </w:t>
+      </w:r>
+      <w:hyperlink r:id="rId11" w:history="1">
+        <w:r>
+          <w:rPr>
+            <w:rStyle w:val="Hyperlink"/>
+          </w:rPr>
+          <w:t>https://pubmed.ncbi.nlm.nih.gov/36711902/</w:t>
+        </w:r>
+      </w:hyperlink>
+      <w:r>
+        <w:t xml:space="preserve">) </w:t>
+      </w:r>
+      <w:r>
+        <w:t xml:space="preserve">. The motivation for </w:t>
+      </w:r>
+      <w:r>
+        <w:t>this work</w:t>
+      </w:r>
+      <w:r>
+        <w:t xml:space="preserve"> </w:t>
+      </w:r>
+      <w:r>
+        <w:t>is</w:t>
+      </w:r>
+      <w:r>
+        <w:t xml:space="preserve"> twofold:</w:t>
+      </w:r>
+      <w:r>
+        <w:t xml:space="preserve"> to provide elected officials with data for the districts they represent</w:t>
+      </w:r>
+      <w:r>
+        <w:t xml:space="preserve">, </w:t>
+      </w:r>
+      <w:r>
+        <w:t>and</w:t>
+      </w:r>
+      <w:r>
+        <w:t xml:space="preserve"> to provide </w:t>
+      </w:r>
+      <w:r>
+        <w:t>residents, constituents, and advocates</w:t>
+      </w:r>
+      <w:r>
+        <w:t xml:space="preserve"> with data on the health of their own districts and </w:t>
+      </w:r>
+      <w:r>
+        <w:t>broader community</w:t>
+      </w:r>
+      <w:r>
+        <w:t xml:space="preserve">.  </w:t>
+      </w:r>
+    </w:p>
+    <w:p>
+      <w:r>
+        <w:t xml:space="preserve">Nearly all </w:t>
+      </w:r>
+      <w:r>
+        <w:t>studies</w:t>
+      </w:r>
+      <w:r>
+        <w:t xml:space="preserve"> using geopolitical districts</w:t>
+      </w:r>
+      <w:r>
+        <w:t xml:space="preserve"> have </w:t>
+      </w:r>
+      <w:r>
+        <w:t>used</w:t>
+      </w:r>
+      <w:r>
+        <w:t xml:space="preserve"> US congressional districts, with X number of studies using state districts. However, to our knowledge no studies have been published reporting health metrics using city council district boundaries. It is important to understand the jurisdiction and influence that each level of governmen</w:t>
+      </w:r>
+      <w:commentRangeStart w:id="0"/>
+      <w:commentRangeStart w:id="1"/>
+      <w:r>
+        <w:t>t can have</w:t>
+      </w:r>
+      <w:r>
+        <w:t xml:space="preserve"> (cite:</w:t>
+      </w:r>
+      <w:r>
+        <w:t xml:space="preserve"> https://pubmed.ncbi.nlm.nih.gov/36274459/</w:t>
+      </w:r>
+      <w:r>
+        <w:t>)</w:t>
+      </w:r>
+      <w:r>
+        <w:t xml:space="preserve">. </w:t>
+      </w:r>
+      <w:commentRangeEnd w:id="0"/>
+      <w:r>
+        <w:rPr>
+          <w:rStyle w:val="CommentReference"/>
+          <w:sz w:val="24"/>
+          <w:szCs w:val="24"/>
+        </w:rPr>
+        <w:commentReference w:id="0"/>
+      </w:r>
+      <w:commentRangeEnd w:id="1"/>
+      <w:r>
+        <w:rPr>
+          <w:rStyle w:val="CommentReference"/>
+          <w:sz w:val="24"/>
+          <w:szCs w:val="24"/>
+        </w:rPr>
+        <w:commentReference w:id="1"/>
+      </w:r>
+      <w:r>
+        <w:t xml:space="preserve">The city, </w:t>
+      </w:r>
+      <w:r>
+        <w:t xml:space="preserve">as compared to the </w:t>
+      </w:r>
+      <w:r>
+        <w:t xml:space="preserve">county, state or </w:t>
+      </w:r>
+      <w:r>
+        <w:t>federal level, is an important</w:t>
+      </w:r>
+      <w:r>
+        <w:t xml:space="preserve"> and unique</w:t>
+      </w:r>
+      <w:r>
+        <w:t xml:space="preserve"> </w:t>
+      </w:r>
+      <w:r>
+        <w:t>site</w:t>
+      </w:r>
+      <w:r>
+        <w:t xml:space="preserve"> of public health influence.</w:t>
+      </w:r>
+      <w:r>
+        <w:t xml:space="preserve"> </w:t>
+      </w:r>
+      <w:commentRangeStart w:id="2"/>
+      <w:r>
+        <w:t xml:space="preserve">Cities have </w:t>
+      </w:r>
+      <w:r>
+        <w:t>distinct public health needs as well as access to unique resources not always available in rural settings</w:t>
+      </w:r>
+      <w:r>
+        <w:t xml:space="preserve"> (CITE)</w:t>
+      </w:r>
+      <w:r>
+        <w:t xml:space="preserve">. </w:t>
+      </w:r>
+      <w:commentRangeEnd w:id="2"/>
+      <w:r>
+        <w:rPr>
+          <w:rStyle w:val="CommentReference"/>
+        </w:rPr>
+        <w:commentReference w:id="2"/>
+      </w:r>
+      <w:r>
+        <w:t xml:space="preserve">City councils have </w:t>
+      </w:r>
+      <w:r>
+        <w:t>con</w:t>
+      </w:r>
+      <w:commentRangeStart w:id="3"/>
+      <w:r>
+        <w:t>trol over policies and resources affecting the health and lives of their constituents</w:t>
+      </w:r>
+      <w:commentRangeEnd w:id="3"/>
+      <w:r>
+        <w:rPr>
+          <w:rStyle w:val="CommentReference"/>
+          <w:sz w:val="24"/>
+          <w:szCs w:val="24"/>
+        </w:rPr>
+        <w:commentReference w:id="3"/>
+      </w:r>
+      <w:r>
+        <w:t xml:space="preserve"> and there for council districts are an important geography to investigate</w:t>
+      </w:r>
+      <w:r>
+        <w:t xml:space="preserve">. </w:t>
+      </w:r>
+      <w:r>
+        <w:t xml:space="preserve">In this analysis we use </w:t>
+      </w:r>
+      <w:r>
+        <w:t>Philadelphia</w:t>
+      </w:r>
+      <w:r>
+        <w:t xml:space="preserve"> as a case study to explore health outcomes by City Council </w:t>
+      </w:r>
+      <w:r>
+        <w:t>d</w:t>
+      </w:r>
+      <w:r>
+        <w:t>istrict</w:t>
+      </w:r>
+      <w:r>
+        <w:t xml:space="preserve">. </w:t>
+      </w:r>
+      <w:r>
+        <w:t>Philadelphia</w:t>
+      </w:r>
+      <w:r>
+        <w:t>’s City Council is comprised of 17 members</w:t>
+      </w:r>
+      <w:r>
+        <w:t>:</w:t>
+      </w:r>
+      <w:r>
+        <w:t xml:space="preserve"> </w:t>
+      </w:r>
+      <w:r>
+        <w:t>10</w:t>
+      </w:r>
+      <w:r>
+        <w:t xml:space="preserve"> </w:t>
+      </w:r>
+      <w:r>
+        <w:t>who are elected by and</w:t>
+      </w:r>
+      <w:r>
+        <w:t xml:space="preserve"> represent a </w:t>
+      </w:r>
+      <w:r>
+        <w:t>specific</w:t>
+      </w:r>
+      <w:r>
+        <w:t xml:space="preserve"> district</w:t>
+      </w:r>
+      <w:r>
+        <w:t>,</w:t>
+      </w:r>
+      <w:r>
+        <w:t xml:space="preserve"> and 7</w:t>
+      </w:r>
+      <w:r>
+        <w:t xml:space="preserve"> at</w:t>
+      </w:r>
+      <w:r>
+        <w:t>-</w:t>
+      </w:r>
+      <w:r>
+        <w:t>large members</w:t>
+      </w:r>
+      <w:r>
+        <w:t>. All councilors</w:t>
+      </w:r>
+      <w:r>
+        <w:t xml:space="preserve"> serve </w:t>
+      </w:r>
+      <w:r>
+        <w:t>4</w:t>
+      </w:r>
+      <w:r>
+        <w:t>-</w:t>
+      </w:r>
+      <w:r>
+        <w:t xml:space="preserve">year terms. </w:t>
+      </w:r>
+    </w:p>
+    <w:p>
+      <w:r>
+        <w:lastRenderedPageBreak/>
+        <w:t xml:space="preserve">To both understand the health status and existing inequities in Philadelphia and to </w:t>
+      </w:r>
+      <w:r>
+        <w:t>aid</w:t>
+      </w:r>
+      <w:r>
+        <w:t xml:space="preserve"> city council members </w:t>
+      </w:r>
+      <w:r>
+        <w:t>and</w:t>
+      </w:r>
+      <w:r>
+        <w:t xml:space="preserve"> constituents, we created a dashboard that displays health and related metrics by council district</w:t>
+      </w:r>
+      <w:r>
+        <w:t xml:space="preserve"> for Philadelphia</w:t>
+      </w:r>
+      <w:r>
+        <w:t xml:space="preserve">. In this </w:t>
+      </w:r>
+      <w:r>
+        <w:t>article</w:t>
+      </w:r>
+      <w:commentRangeStart w:id="4"/>
+      <w:r>
+        <w:t>, we investigate and present two health metrics</w:t>
+      </w:r>
+      <w:r>
+        <w:t xml:space="preserve"> from the dashboard</w:t>
+      </w:r>
+      <w:r>
+        <w:t xml:space="preserve">, tree canopy coverage and health uninsurance, and assess their magnitude and distribution across the city. </w:t>
+      </w:r>
+      <w:commentRangeEnd w:id="4"/>
+      <w:r>
+        <w:rPr>
+          <w:rStyle w:val="CommentReference"/>
+          <w:sz w:val="24"/>
+          <w:szCs w:val="24"/>
+        </w:rPr>
+        <w:commentReference w:id="4"/>
+      </w:r>
+      <w:r>
+        <w:t xml:space="preserve">We </w:t>
+      </w:r>
+      <w:r>
+        <w:t xml:space="preserve">aim to present descriptive data for </w:t>
+      </w:r>
+      <w:r>
+        <w:t xml:space="preserve">Philadelphia as well as </w:t>
+      </w:r>
+      <w:r>
+        <w:t>demonstrate the process</w:t>
+      </w:r>
+      <w:r>
+        <w:t xml:space="preserve">, </w:t>
+      </w:r>
+      <w:r>
+        <w:t>feasibilit</w:t>
+      </w:r>
+      <w:r>
+        <w:t>y, and utility</w:t>
+      </w:r>
+      <w:r>
+        <w:t xml:space="preserve"> of </w:t>
+      </w:r>
+      <w:r>
+        <w:t xml:space="preserve">conducting an analysis using city council districts which can be replicated in other jurisdictions. </w:t>
+      </w:r>
+    </w:p>
+    <w:p>
+      <w:pPr>
+        <w:rPr>
+          <w:b/>
+          <w:bCs/>
+        </w:rPr>
+      </w:pPr>
+      <w:r>
+        <w:rPr>
+          <w:b/>
+          <w:bCs/>
+        </w:rPr>
+        <w:t xml:space="preserve">Dashboard: </w:t>
+      </w:r>
+      <w:hyperlink r:id="rId16" w:history="1">
+        <w:r>
+          <w:rPr>
+            <w:rStyle w:val="Hyperlink"/>
+          </w:rPr>
+          <w:t>https://drexel-uhc.github.io/philadelphia-council-districts-and-health/?metric=hs_grad_pct</w:t>
+        </w:r>
+      </w:hyperlink>
+      <w:r>
+        <w:rPr>
+          <w:b/>
+          <w:bCs/>
+        </w:rPr>
+        <w:t xml:space="preserve"> </w:t>
+      </w:r>
+    </w:p>
+    <w:p>
+      <w:r>
+        <w:t xml:space="preserve">Other articles using council districts: </w:t>
+      </w:r>
+      <w:hyperlink r:id="rId17" w:history="1">
+        <w:r>
+          <w:rPr>
+            <w:rStyle w:val="Hyperlink"/>
+          </w:rPr>
+          <w:t>http://www.rvadirt.com/s/RVA-Health-Inequality-by-District.pdf</w:t>
         </w:r>
       </w:hyperlink>
       <w:r>
@@ -206,106 +676,297 @@
           <w:bCs/>
         </w:rPr>
       </w:pPr>
+      <w:commentRangeStart w:id="5"/>
       <w:r>
         <w:rPr>
           <w:b/>
           <w:bCs/>
         </w:rPr>
-        <w:lastRenderedPageBreak/>
         <w:t>Methods</w:t>
+      </w:r>
+      <w:commentRangeEnd w:id="5"/>
+      <w:r>
+        <w:rPr>
+          <w:rStyle w:val="CommentReference"/>
+          <w:b/>
+          <w:bCs/>
+          <w:sz w:val="24"/>
+          <w:szCs w:val="24"/>
+        </w:rPr>
+        <w:commentReference w:id="5"/>
       </w:r>
     </w:p>
     <w:p>
       <w:r>
-        <w:t>In</w:t>
-      </w:r>
-      <w:r>
-        <w:t xml:space="preserve"> this paper we describe two out of ## metrics that are displayed on the Philadelphia Council District Health Dashboard: the percentage of residents lacking </w:t>
-      </w:r>
-      <w:r>
-        <w:t>health</w:t>
-      </w:r>
-      <w:r>
-        <w:t xml:space="preserve"> insurance and the percentage tree canopy cover. </w:t>
-      </w:r>
-      <w:r>
-        <w:t xml:space="preserve">Data for Philadelphia council districts was </w:t>
-      </w:r>
-      <w:r>
-        <w:t>obtained</w:t>
-      </w:r>
-      <w:r>
-        <w:t xml:space="preserve"> from the American Community Survey 5-year estimates</w:t>
-      </w:r>
-      <w:r>
-        <w:t xml:space="preserve"> for 2018-2022</w:t>
+        <w:t xml:space="preserve">Like federal congressional districts, </w:t>
+      </w:r>
+      <w:r>
+        <w:t>Philadelphia</w:t>
+      </w:r>
+      <w:r>
+        <w:t xml:space="preserve"> City Council districts are re-drawn once ever ten years following the release of the</w:t>
+      </w:r>
+      <w:r>
+        <w:t xml:space="preserve"> US</w:t>
+      </w:r>
+      <w:r>
+        <w:t xml:space="preserve"> decennial census. </w:t>
+      </w:r>
+      <w:r>
+        <w:t xml:space="preserve">After the release of the 2020 US census data, </w:t>
+      </w:r>
+      <w:r>
+        <w:t xml:space="preserve">City Council approved </w:t>
+      </w:r>
+      <w:r>
+        <w:t xml:space="preserve">the final </w:t>
+      </w:r>
+      <w:r>
+        <w:t>Philadelphia</w:t>
+      </w:r>
+      <w:r>
+        <w:t xml:space="preserve"> </w:t>
+      </w:r>
+      <w:r>
+        <w:t xml:space="preserve">district </w:t>
+      </w:r>
+      <w:r>
+        <w:t xml:space="preserve">map </w:t>
+      </w:r>
+      <w:r>
+        <w:t>on February 10</w:t>
+      </w:r>
+      <w:r>
+        <w:t>, 2023</w:t>
+      </w:r>
+      <w:r>
+        <w:t xml:space="preserve">. Barring any litigation, </w:t>
+      </w:r>
+      <w:r>
+        <w:t>City Council</w:t>
+      </w:r>
+      <w:r>
+        <w:t xml:space="preserve"> will use this map for</w:t>
+      </w:r>
+      <w:r>
+        <w:t xml:space="preserve"> elections through 2031. We used the</w:t>
+      </w:r>
+      <w:r>
+        <w:t>se</w:t>
+      </w:r>
+      <w:r>
+        <w:t xml:space="preserve"> 2023 boundaries </w:t>
+      </w:r>
+      <w:r>
+        <w:t>for</w:t>
+      </w:r>
+      <w:r>
+        <w:t xml:space="preserve"> </w:t>
+      </w:r>
+      <w:r>
+        <w:t xml:space="preserve">the Philadelphia Council District Health Dashboard and </w:t>
+      </w:r>
+      <w:r>
+        <w:t xml:space="preserve">this </w:t>
+      </w:r>
+      <w:r>
+        <w:t>analysis</w:t>
       </w:r>
       <w:r>
         <w:t xml:space="preserve">. </w:t>
-      </w:r>
-      <w:r>
-        <w:t>Calculating metrics by council district is challenging because health data are not commonly provided by that geographic unit. To calculate data by district, a multi</w:t>
-      </w:r>
-      <w:r>
-        <w:t>-</w:t>
-      </w:r>
-      <w:r>
-        <w:t xml:space="preserve">step process is used. ACS data are obtained by census tract, which </w:t>
-      </w:r>
-      <w:r>
-        <w:t xml:space="preserve">is </w:t>
-      </w:r>
-      <w:r>
-        <w:t>the smalle</w:t>
-      </w:r>
-      <w:r>
-        <w:t>st</w:t>
-      </w:r>
-      <w:r>
-        <w:t xml:space="preserve"> geographic unit available for the health insurance variable. However, because census tracts do not nest perfectly into council districts, they </w:t>
-      </w:r>
-      <w:r>
-        <w:t>are</w:t>
-      </w:r>
-      <w:r>
-        <w:t xml:space="preserve"> weighted by census block population and then aggregated to the district level. </w:t>
-      </w:r>
-      <w:r>
-        <w:t xml:space="preserve">This is a method that has been used and described elsewhere (CITE). </w:t>
       </w:r>
     </w:p>
     <w:p>
       <w:r>
-        <w:t xml:space="preserve">Data on tree canopy coverage </w:t>
-      </w:r>
-      <w:r>
-        <w:t xml:space="preserve">was </w:t>
-      </w:r>
-      <w:r>
-        <w:t>obtained from t</w:t>
-      </w:r>
-      <w:r>
-        <w:t>he Urban Health Collaborative at Drexel University</w:t>
-      </w:r>
-      <w:r>
-        <w:t xml:space="preserve"> at the census tract level for 20XX(?)</w:t>
-      </w:r>
-      <w:r>
-        <w:t>.</w:t>
-      </w:r>
-      <w:r>
-        <w:t xml:space="preserve"> The aggregation process described above was used to estimate tree coverage at the district level, however census block </w:t>
-      </w:r>
-      <w:r>
-        <w:t xml:space="preserve">area </w:t>
-      </w:r>
-      <w:r>
-        <w:t xml:space="preserve">values were used instead of population values. </w:t>
+        <w:t>In</w:t>
+      </w:r>
+      <w:r>
+        <w:t xml:space="preserve"> this </w:t>
+      </w:r>
+      <w:r>
+        <w:t>article</w:t>
+      </w:r>
+      <w:r>
+        <w:t>,</w:t>
+      </w:r>
+      <w:r>
+        <w:t xml:space="preserve"> we describe two out of ## metrics that are displayed on the Dashboard: the percentage of residents lacking </w:t>
+      </w:r>
+      <w:r>
+        <w:t>health</w:t>
+      </w:r>
+      <w:r>
+        <w:t xml:space="preserve"> insurance and the percentage tree canopy </w:t>
+      </w:r>
+      <w:commentRangeStart w:id="6"/>
+      <w:r>
+        <w:t>cover.</w:t>
+      </w:r>
+      <w:commentRangeEnd w:id="6"/>
+      <w:r>
+        <w:rPr>
+          <w:rStyle w:val="CommentReference"/>
+          <w:sz w:val="24"/>
+          <w:szCs w:val="24"/>
+        </w:rPr>
+        <w:commentReference w:id="6"/>
+      </w:r>
+      <w:r>
+        <w:t xml:space="preserve"> </w:t>
+      </w:r>
+      <w:r>
+        <w:t xml:space="preserve"> We focus on these metrics because</w:t>
+      </w:r>
+      <w:r>
+        <w:t xml:space="preserve"> they are timely and relevant public health metrics</w:t>
+      </w:r>
+      <w:r>
+        <w:t xml:space="preserve"> that have different </w:t>
+      </w:r>
+      <w:r>
+        <w:t>distributions</w:t>
+      </w:r>
+      <w:r>
+        <w:t xml:space="preserve"> across City Council Districts</w:t>
+      </w:r>
+      <w:r>
+        <w:t xml:space="preserve"> and</w:t>
+      </w:r>
+      <w:r>
+        <w:t xml:space="preserve"> warrant different types of public health response</w:t>
+      </w:r>
+      <w:r>
+        <w:t xml:space="preserve">s. </w:t>
+      </w:r>
+      <w:r>
+        <w:t>We obtained population and insurance d</w:t>
+      </w:r>
+      <w:r>
+        <w:t>ata for Philadelphia council districts from the American Community Survey</w:t>
+      </w:r>
+      <w:r>
+        <w:t xml:space="preserve"> (ACS)</w:t>
+      </w:r>
+      <w:r>
+        <w:t xml:space="preserve"> 5-year estimates</w:t>
+      </w:r>
+      <w:r>
+        <w:t xml:space="preserve"> for 2018-2022</w:t>
+      </w:r>
+      <w:r>
+        <w:t xml:space="preserve">. </w:t>
       </w:r>
     </w:p>
     <w:p>
       <w:r>
-        <w:t xml:space="preserve">The estimates of the percentage of residents lacking health insurance </w:t>
+        <w:t xml:space="preserve">Calculating metrics by council district is challenging because health data are not commonly provided by that geographic unit. To calculate </w:t>
+      </w:r>
+      <w:r>
+        <w:t xml:space="preserve">ACS </w:t>
+      </w:r>
+      <w:r>
+        <w:t xml:space="preserve">data by district, </w:t>
+      </w:r>
+      <w:r>
+        <w:t>we used a</w:t>
+      </w:r>
+      <w:r>
+        <w:t xml:space="preserve"> multi</w:t>
+      </w:r>
+      <w:r>
+        <w:t>-</w:t>
+      </w:r>
+      <w:r>
+        <w:t>step process.</w:t>
+      </w:r>
+      <w:r>
+        <w:t xml:space="preserve"> First,</w:t>
+      </w:r>
+      <w:r>
+        <w:t xml:space="preserve"> ACS data are obtained by census tract, which </w:t>
+      </w:r>
+      <w:r>
+        <w:t xml:space="preserve">is </w:t>
+      </w:r>
+      <w:r>
+        <w:t>the smalle</w:t>
+      </w:r>
+      <w:r>
+        <w:t>st</w:t>
+      </w:r>
+      <w:r>
+        <w:t xml:space="preserve"> geographic unit available for the health insurance variable. </w:t>
+      </w:r>
+      <w:r>
+        <w:t xml:space="preserve">Then, </w:t>
+      </w:r>
+      <w:r>
+        <w:t xml:space="preserve">because census tracts do not nest perfectly into council districts, they </w:t>
+      </w:r>
+      <w:r>
+        <w:t>are</w:t>
+      </w:r>
+      <w:r>
+        <w:t xml:space="preserve"> weighted by census block population and</w:t>
+      </w:r>
+      <w:r>
+        <w:t xml:space="preserve"> lastly, they are</w:t>
+      </w:r>
+      <w:r>
+        <w:t xml:space="preserve"> aggregated to the district level. </w:t>
+      </w:r>
+      <w:r>
+        <w:t xml:space="preserve">This is a method that has been used and described elsewhere (CITE). </w:t>
+      </w:r>
+    </w:p>
+    <w:p>
+      <w:r>
+        <w:lastRenderedPageBreak/>
+        <w:t>We obtained d</w:t>
+      </w:r>
+      <w:r>
+        <w:t xml:space="preserve">ata on tree canopy coverage from the Urban Health Collaborative at Drexel University at the census tract level for 20XX(?). </w:t>
+      </w:r>
+      <w:r>
+        <w:t xml:space="preserve">We used the </w:t>
+      </w:r>
+      <w:r>
+        <w:t xml:space="preserve">aggregation process described above to estimate tree coverage at the district </w:t>
+      </w:r>
+      <w:r>
+        <w:t>level;</w:t>
+      </w:r>
+      <w:r>
+        <w:t xml:space="preserve"> however</w:t>
+      </w:r>
+      <w:r>
+        <w:t>,</w:t>
+      </w:r>
+      <w:r>
+        <w:t xml:space="preserve"> </w:t>
+      </w:r>
+      <w:r>
+        <w:t xml:space="preserve">we weighted tract data by </w:t>
+      </w:r>
+      <w:r>
+        <w:t xml:space="preserve">census block </w:t>
+      </w:r>
+      <w:r>
+        <w:t xml:space="preserve">area </w:t>
+      </w:r>
+      <w:r>
+        <w:t xml:space="preserve">instead of population. </w:t>
+      </w:r>
+    </w:p>
+    <w:p>
+      <w:r>
+        <w:t>We report</w:t>
+      </w:r>
+      <w:r>
+        <w:t xml:space="preserve"> t</w:t>
+      </w:r>
+      <w:r>
+        <w:t xml:space="preserve">he estimates of the percentage of residents lacking health insurance </w:t>
       </w:r>
       <w:r>
         <w:t xml:space="preserve">and percentage tree canopy coverage were reported </w:t>
@@ -323,7 +984,13 @@
         <w:t>value</w:t>
       </w:r>
       <w:r>
-        <w:t xml:space="preserve"> for the standard deviation between district level values. We also provide maps of the district and census tract values of the percentage of residents lacking health insurance. </w:t>
+        <w:t xml:space="preserve"> for the standard deviation between district level values. We also provide maps of the district and census tract values</w:t>
+      </w:r>
+      <w:r>
+        <w:t>, to show within district variation,</w:t>
+      </w:r>
+      <w:r>
+        <w:t xml:space="preserve"> of the percentage of residents lacking health insurance. </w:t>
       </w:r>
     </w:p>
     <w:p>
@@ -343,7 +1010,25 @@
     </w:p>
     <w:p>
       <w:r>
-        <w:t>There are ten city council districts in Philadelphia, each have a population of approximately 160,000 people and are represented by a single elected council member. The percentage of residence that lack health insurance ranged from</w:t>
+        <w:t xml:space="preserve">There are ten city council districts in Philadelphia, each have a population of approximately 160,000 people and </w:t>
+      </w:r>
+      <w:r>
+        <w:t>directly elect one City</w:t>
+      </w:r>
+      <w:r>
+        <w:t xml:space="preserve"> </w:t>
+      </w:r>
+      <w:r>
+        <w:t>C</w:t>
+      </w:r>
+      <w:r>
+        <w:t xml:space="preserve">ouncil </w:t>
+      </w:r>
+      <w:r>
+        <w:t>representative</w:t>
+      </w:r>
+      <w:r>
+        <w:t>. The percentage of residence that lack health insurance ranged from</w:t>
       </w:r>
       <w:r>
         <w:t xml:space="preserve"> 4.9% in district 4 to</w:t>
@@ -352,31 +1037,180 @@
         <w:t xml:space="preserve"> 11.7% in district 7</w:t>
       </w:r>
       <w:r>
+        <w:t xml:space="preserve"> (</w:t>
+      </w:r>
+      <w:r>
+        <w:t>Table 1</w:t>
+      </w:r>
+      <w:r>
+        <w:t>)</w:t>
+      </w:r>
+      <w:r>
         <w:t xml:space="preserve">. </w:t>
       </w:r>
       <w:r>
-        <w:t xml:space="preserve">Across the city, the standard deviation between council districts was 2.1, which means that most districts fell within 2.1 points of the average. However, within districts there was more variation. The district with the highest internal variation was district 6, which had a standard deviation of 5.5 and the district with the lowest was district 4, which had a standard deviation of 2.8. </w:t>
+        <w:t>Across the city, the standard deviation between council districts was 2.1, which means that most districts fell within 2.1 points of the average</w:t>
+      </w:r>
+      <w:ins w:id="7" w:author="Schnake-Mahl,Alina" w:date="2025-07-15T17:22:00Z">
+        <w:r>
+          <w:t xml:space="preserve"> (add city average?)</w:t>
+        </w:r>
+      </w:ins>
+      <w:r>
+        <w:t xml:space="preserve">. However, within districts there was more variation. The district with the highest internal variation was district 6, which had a standard deviation of 5.5 and the district with the lowest was district 4, which had a standard deviation of 2.8. </w:t>
       </w:r>
     </w:p>
     <w:p>
       <w:r>
-        <w:t xml:space="preserve">For tree canopy coverage, the districts with the most tree canopy coverage were districts 4 and 19, which both had 19% coverage. The district with the </w:t>
-      </w:r>
-      <w:r>
-        <w:t>least tree</w:t>
-      </w:r>
-      <w:r>
-        <w:t xml:space="preserve"> coverage was </w:t>
-      </w:r>
-      <w:r>
-        <w:t xml:space="preserve">district 1 with only 1.8% coverage. There was a fairly high degree of variation between districts with a standard deviation of 6.4, which is higher than the standard deviation for lacking health </w:t>
-      </w:r>
-      <w:r>
-        <w:lastRenderedPageBreak/>
-        <w:t xml:space="preserve">insurance. There were also some districts with high internal variation, specifically, districts 4 and 8 had the highest while district 1 had the lowest. </w:t>
+        <w:t>For tree canopy coverage, the districts with the most tree canopy coverage were districts 4 and 19, which both had 19%</w:t>
+      </w:r>
+      <w:commentRangeStart w:id="8"/>
+      <w:r>
+        <w:t xml:space="preserve"> coverage</w:t>
+      </w:r>
+      <w:r>
+        <w:t xml:space="preserve"> (i.e. </w:t>
+      </w:r>
+      <w:r>
+        <w:t>tree canopy covered 19% of the district area)</w:t>
+      </w:r>
+      <w:r>
+        <w:t xml:space="preserve"> </w:t>
+      </w:r>
+      <w:r>
+        <w:t xml:space="preserve">. </w:t>
+      </w:r>
+      <w:commentRangeEnd w:id="8"/>
+      <w:r>
+        <w:rPr>
+          <w:rStyle w:val="CommentReference"/>
+          <w:sz w:val="24"/>
+          <w:szCs w:val="24"/>
+        </w:rPr>
+        <w:commentReference w:id="8"/>
+      </w:r>
+      <w:r>
+        <w:t xml:space="preserve">The district with the </w:t>
+      </w:r>
+      <w:r>
+        <w:t xml:space="preserve">least </w:t>
+      </w:r>
+      <w:r>
+        <w:t xml:space="preserve">coverage was </w:t>
+      </w:r>
+      <w:r>
+        <w:t xml:space="preserve">district 1 with only 1.8% coverage. </w:t>
+      </w:r>
+      <w:r>
+        <w:t xml:space="preserve">The standard deviation </w:t>
+      </w:r>
+      <w:r>
+        <w:t xml:space="preserve">for tree canopy coverage </w:t>
+      </w:r>
+      <w:r>
+        <w:t>across districts was</w:t>
+      </w:r>
+      <w:r>
+        <w:t xml:space="preserve"> </w:t>
+      </w:r>
+      <w:r>
+        <w:t xml:space="preserve">6.4, which is higher than the standard deviation for lacking health insurance. </w:t>
+      </w:r>
+      <w:r>
+        <w:t xml:space="preserve">Districts </w:t>
+      </w:r>
+      <w:r>
+        <w:t xml:space="preserve">4 and 8 had the highest </w:t>
+      </w:r>
+      <w:r>
+        <w:t>internal variation in tree canopy coverage</w:t>
+      </w:r>
+      <w:r>
+        <w:t xml:space="preserve"> (</w:t>
+      </w:r>
+      <w:r>
+        <w:rPr>
+          <w:rFonts w:ascii="Calibri" w:hAnsi="Calibri" w:cs="Calibri"/>
+          <w:color w:val="000000"/>
+          <w:kern w:val="0"/>
+          <w:sz w:val="22"/>
+          <w:szCs w:val="22"/>
+        </w:rPr>
+        <w:t>18.5 and 14.8 respectively)</w:t>
+      </w:r>
+      <w:r>
+        <w:rPr>
+          <w:rFonts w:ascii="Calibri" w:hAnsi="Calibri" w:cs="Calibri"/>
+          <w:color w:val="000000"/>
+          <w:kern w:val="0"/>
+          <w:sz w:val="22"/>
+          <w:szCs w:val="22"/>
+        </w:rPr>
+        <w:t xml:space="preserve"> </w:t>
+      </w:r>
+      <w:r>
+        <w:t>while district 1 had the lowest</w:t>
+      </w:r>
+      <w:r>
+        <w:t xml:space="preserve"> (2.3)</w:t>
+      </w:r>
+      <w:r>
+        <w:t xml:space="preserve">. </w:t>
+      </w:r>
+      <w:commentRangeStart w:id="9"/>
+      <w:commentRangeEnd w:id="9"/>
+      <w:r>
+        <w:rPr>
+          <w:rStyle w:val="CommentReference"/>
+          <w:sz w:val="24"/>
+          <w:szCs w:val="24"/>
+        </w:rPr>
+        <w:commentReference w:id="9"/>
       </w:r>
     </w:p>
-    <w:p/>
+    <w:p>
+      <w:pPr>
+        <w:rPr>
+          <w:b/>
+          <w:bCs/>
+        </w:rPr>
+      </w:pPr>
+      <w:r>
+        <w:rPr>
+          <w:b/>
+          <w:bCs/>
+        </w:rPr>
+        <w:t>Table 1.</w:t>
+      </w:r>
+      <w:r>
+        <w:rPr>
+          <w:b/>
+          <w:bCs/>
+        </w:rPr>
+        <w:t xml:space="preserve"> </w:t>
+      </w:r>
+      <w:r>
+        <w:rPr>
+          <w:b/>
+          <w:bCs/>
+        </w:rPr>
+        <w:t xml:space="preserve">Lack of Health Insurance </w:t>
+      </w:r>
+      <w:r>
+        <w:rPr>
+          <w:b/>
+          <w:bCs/>
+        </w:rPr>
+        <w:t>by Philadelphia City Council District, 2018-2022</w:t>
+      </w:r>
+      <w:r>
+        <w:rPr>
+          <w:b/>
+          <w:bCs/>
+        </w:rPr>
+        <w:t xml:space="preserve"> </w:t>
+      </w:r>
+    </w:p>
     <w:tbl>
       <w:tblPr>
         <w:tblStyle w:val="TableGrid"/>
@@ -458,9 +1292,20 @@
                 <w:sz w:val="22"/>
                 <w:szCs w:val="22"/>
               </w:rPr>
-              <w:t>Lacking</w:t>
-            </w:r>
-            <w:r>
+              <w:t>Lacking health insurance (%)</w:t>
+            </w:r>
+          </w:p>
+        </w:tc>
+        <w:tc>
+          <w:tcPr>
+            <w:tcW w:w="3150" w:type="dxa"/>
+          </w:tcPr>
+          <w:p>
+            <w:pPr>
+              <w:autoSpaceDE w:val="0"/>
+              <w:autoSpaceDN w:val="0"/>
+              <w:adjustRightInd w:val="0"/>
+              <w:jc w:val="center"/>
               <w:rPr>
                 <w:rFonts w:ascii="Calibri" w:hAnsi="Calibri" w:cs="Calibri"/>
                 <w:b/>
@@ -470,8 +1315,7 @@
                 <w:sz w:val="22"/>
                 <w:szCs w:val="22"/>
               </w:rPr>
-              <w:t xml:space="preserve"> health insurance</w:t>
-            </w:r>
+            </w:pPr>
             <w:r>
               <w:rPr>
                 <w:rFonts w:ascii="Calibri" w:hAnsi="Calibri" w:cs="Calibri"/>
@@ -482,13 +1326,13 @@
                 <w:sz w:val="22"/>
                 <w:szCs w:val="22"/>
               </w:rPr>
-              <w:t xml:space="preserve"> (%)</w:t>
-            </w:r>
-          </w:p>
-        </w:tc>
-        <w:tc>
-          <w:tcPr>
-            <w:tcW w:w="3150" w:type="dxa"/>
+              <w:t>Standard deviation of tract health insurance within district</w:t>
+            </w:r>
+          </w:p>
+        </w:tc>
+        <w:tc>
+          <w:tcPr>
+            <w:tcW w:w="2056" w:type="dxa"/>
           </w:tcPr>
           <w:p>
             <w:pPr>
@@ -516,65 +1360,7 @@
                 <w:sz w:val="22"/>
                 <w:szCs w:val="22"/>
               </w:rPr>
-              <w:t xml:space="preserve">Standard deviation </w:t>
-            </w:r>
-            <w:r>
-              <w:rPr>
-                <w:rFonts w:ascii="Calibri" w:hAnsi="Calibri" w:cs="Calibri"/>
-                <w:b/>
-                <w:bCs/>
-                <w:color w:val="000000"/>
-                <w:kern w:val="0"/>
-                <w:sz w:val="22"/>
-                <w:szCs w:val="22"/>
-              </w:rPr>
-              <w:t>of tract health insurance within district</w:t>
-            </w:r>
-          </w:p>
-        </w:tc>
-        <w:tc>
-          <w:tcPr>
-            <w:tcW w:w="2056" w:type="dxa"/>
-          </w:tcPr>
-          <w:p>
-            <w:pPr>
-              <w:autoSpaceDE w:val="0"/>
-              <w:autoSpaceDN w:val="0"/>
-              <w:adjustRightInd w:val="0"/>
-              <w:jc w:val="center"/>
-              <w:rPr>
-                <w:rFonts w:ascii="Calibri" w:hAnsi="Calibri" w:cs="Calibri"/>
-                <w:b/>
-                <w:bCs/>
-                <w:color w:val="000000"/>
-                <w:kern w:val="0"/>
-                <w:sz w:val="22"/>
-                <w:szCs w:val="22"/>
-              </w:rPr>
-            </w:pPr>
-            <w:r>
-              <w:rPr>
-                <w:rFonts w:ascii="Calibri" w:hAnsi="Calibri" w:cs="Calibri"/>
-                <w:b/>
-                <w:bCs/>
-                <w:color w:val="000000"/>
-                <w:kern w:val="0"/>
-                <w:sz w:val="22"/>
-                <w:szCs w:val="22"/>
-              </w:rPr>
-              <w:t>Standard deviation</w:t>
-            </w:r>
-            <w:r>
-              <w:rPr>
-                <w:rFonts w:ascii="Calibri" w:hAnsi="Calibri" w:cs="Calibri"/>
-                <w:b/>
-                <w:bCs/>
-                <w:color w:val="000000"/>
-                <w:kern w:val="0"/>
-                <w:sz w:val="22"/>
-                <w:szCs w:val="22"/>
-              </w:rPr>
-              <w:t xml:space="preserve"> between districts</w:t>
+              <w:t>Standard deviation between districts</w:t>
             </w:r>
           </w:p>
         </w:tc>
@@ -1316,6 +2102,7 @@
                 <w:sz w:val="22"/>
                 <w:szCs w:val="22"/>
               </w:rPr>
+              <w:lastRenderedPageBreak/>
               <w:t>7</w:t>
             </w:r>
           </w:p>
@@ -1765,6 +2552,50 @@
         <w:rPr>
           <w:b/>
           <w:bCs/>
+        </w:rPr>
+      </w:pPr>
+      <w:r>
+        <w:rPr>
+          <w:b/>
+          <w:bCs/>
+        </w:rPr>
+        <w:t>Figure 1</w:t>
+      </w:r>
+      <w:r>
+        <w:rPr>
+          <w:b/>
+          <w:bCs/>
+        </w:rPr>
+        <w:t>.</w:t>
+      </w:r>
+      <w:r>
+        <w:rPr>
+          <w:b/>
+          <w:bCs/>
+        </w:rPr>
+        <w:t xml:space="preserve"> Lack of Health Insurance by Philadelphia City Council District, 2018-2022</w:t>
+      </w:r>
+      <w:r>
+        <w:rPr>
+          <w:b/>
+          <w:bCs/>
+        </w:rPr>
+        <w:t xml:space="preserve"> </w:t>
+      </w:r>
+    </w:p>
+    <w:p>
+      <w:pPr>
+        <w:jc w:val="center"/>
+        <w:rPr>
+          <w:b/>
+          <w:bCs/>
+        </w:rPr>
+      </w:pPr>
+    </w:p>
+    <w:p>
+      <w:pPr>
+        <w:rPr>
+          <w:noProof/>
         </w:rPr>
       </w:pPr>
       <w:r>
@@ -1787,7 +2618,7 @@
                     <pic:cNvPicPr/>
                   </pic:nvPicPr>
                   <pic:blipFill>
-                    <a:blip r:embed="rId6"/>
+                    <a:blip r:embed="rId18"/>
                     <a:stretch>
                       <a:fillRect/>
                     </a:stretch>
@@ -1833,7 +2664,7 @@
                     <pic:cNvPicPr/>
                   </pic:nvPicPr>
                   <pic:blipFill>
-                    <a:blip r:embed="rId7"/>
+                    <a:blip r:embed="rId19"/>
                     <a:stretch>
                       <a:fillRect/>
                     </a:stretch>
@@ -1854,6 +2685,49 @@
         </w:drawing>
       </w:r>
     </w:p>
+    <w:p>
+      <w:pPr>
+        <w:rPr>
+          <w:b/>
+          <w:bCs/>
+        </w:rPr>
+      </w:pPr>
+      <w:r>
+        <w:rPr>
+          <w:b/>
+          <w:bCs/>
+        </w:rPr>
+        <w:t xml:space="preserve">Table </w:t>
+      </w:r>
+      <w:r>
+        <w:rPr>
+          <w:b/>
+          <w:bCs/>
+        </w:rPr>
+        <w:t>2</w:t>
+      </w:r>
+      <w:r>
+        <w:rPr>
+          <w:b/>
+          <w:bCs/>
+        </w:rPr>
+        <w:t>.</w:t>
+      </w:r>
+      <w:r>
+        <w:rPr>
+          <w:b/>
+          <w:bCs/>
+        </w:rPr>
+        <w:t xml:space="preserve"> Tree Canopy Coverage by Philadelphia City Council District, 20xx</w:t>
+      </w:r>
+      <w:r>
+        <w:rPr>
+          <w:b/>
+          <w:bCs/>
+        </w:rPr>
+        <w:t xml:space="preserve"> </w:t>
+      </w:r>
+    </w:p>
     <w:tbl>
       <w:tblPr>
         <w:tblStyle w:val="TableGrid"/>
@@ -1969,9 +2843,20 @@
                 <w:sz w:val="22"/>
                 <w:szCs w:val="22"/>
               </w:rPr>
-              <w:t xml:space="preserve">Standard deviation of tract </w:t>
-            </w:r>
-            <w:r>
+              <w:t>Standard deviation of tract tree coverage within district</w:t>
+            </w:r>
+          </w:p>
+        </w:tc>
+        <w:tc>
+          <w:tcPr>
+            <w:tcW w:w="2845" w:type="dxa"/>
+          </w:tcPr>
+          <w:p>
+            <w:pPr>
+              <w:autoSpaceDE w:val="0"/>
+              <w:autoSpaceDN w:val="0"/>
+              <w:adjustRightInd w:val="0"/>
+              <w:jc w:val="center"/>
               <w:rPr>
                 <w:rFonts w:ascii="Calibri" w:hAnsi="Calibri" w:cs="Calibri"/>
                 <w:b/>
@@ -1981,8 +2866,7 @@
                 <w:sz w:val="22"/>
                 <w:szCs w:val="22"/>
               </w:rPr>
-              <w:t xml:space="preserve">tree coverage </w:t>
-            </w:r>
+            </w:pPr>
             <w:r>
               <w:rPr>
                 <w:rFonts w:ascii="Calibri" w:hAnsi="Calibri" w:cs="Calibri"/>
@@ -1993,65 +2877,7 @@
                 <w:sz w:val="22"/>
                 <w:szCs w:val="22"/>
               </w:rPr>
-              <w:t>within district</w:t>
-            </w:r>
-          </w:p>
-        </w:tc>
-        <w:tc>
-          <w:tcPr>
-            <w:tcW w:w="2845" w:type="dxa"/>
-          </w:tcPr>
-          <w:p>
-            <w:pPr>
-              <w:autoSpaceDE w:val="0"/>
-              <w:autoSpaceDN w:val="0"/>
-              <w:adjustRightInd w:val="0"/>
-              <w:jc w:val="center"/>
-              <w:rPr>
-                <w:rFonts w:ascii="Calibri" w:hAnsi="Calibri" w:cs="Calibri"/>
-                <w:b/>
-                <w:bCs/>
-                <w:color w:val="000000"/>
-                <w:kern w:val="0"/>
-                <w:sz w:val="22"/>
-                <w:szCs w:val="22"/>
-              </w:rPr>
-            </w:pPr>
-            <w:r>
-              <w:rPr>
-                <w:rFonts w:ascii="Calibri" w:hAnsi="Calibri" w:cs="Calibri"/>
-                <w:b/>
-                <w:bCs/>
-                <w:color w:val="000000"/>
-                <w:kern w:val="0"/>
-                <w:sz w:val="22"/>
-                <w:szCs w:val="22"/>
-              </w:rPr>
-              <w:t xml:space="preserve">Standard deviation </w:t>
-            </w:r>
-            <w:r>
-              <w:rPr>
-                <w:rFonts w:ascii="Calibri" w:hAnsi="Calibri" w:cs="Calibri"/>
-                <w:b/>
-                <w:bCs/>
-                <w:color w:val="000000"/>
-                <w:kern w:val="0"/>
-                <w:sz w:val="22"/>
-                <w:szCs w:val="22"/>
-              </w:rPr>
-              <w:t xml:space="preserve">of tree coverage </w:t>
-            </w:r>
-            <w:r>
-              <w:rPr>
-                <w:rFonts w:ascii="Calibri" w:hAnsi="Calibri" w:cs="Calibri"/>
-                <w:b/>
-                <w:bCs/>
-                <w:color w:val="000000"/>
-                <w:kern w:val="0"/>
-                <w:sz w:val="22"/>
-                <w:szCs w:val="22"/>
-              </w:rPr>
-              <w:t>between districts</w:t>
+              <w:t>Standard deviation of tree coverage between districts</w:t>
             </w:r>
           </w:p>
         </w:tc>
@@ -2475,17 +3301,7 @@
                 <w:sz w:val="22"/>
                 <w:szCs w:val="22"/>
               </w:rPr>
-              <w:t>19</w:t>
-            </w:r>
-            <w:r>
-              <w:rPr>
-                <w:rFonts w:ascii="Calibri" w:hAnsi="Calibri" w:cs="Calibri"/>
-                <w:color w:val="000000"/>
-                <w:kern w:val="0"/>
-                <w:sz w:val="22"/>
-                <w:szCs w:val="22"/>
-              </w:rPr>
-              <w:t>.0</w:t>
+              <w:t>19.0</w:t>
             </w:r>
           </w:p>
         </w:tc>
@@ -2631,17 +3447,7 @@
                 <w:sz w:val="22"/>
                 <w:szCs w:val="22"/>
               </w:rPr>
-              <w:t>3</w:t>
-            </w:r>
-            <w:r>
-              <w:rPr>
-                <w:rFonts w:ascii="Calibri" w:hAnsi="Calibri" w:cs="Calibri"/>
-                <w:color w:val="000000"/>
-                <w:kern w:val="0"/>
-                <w:sz w:val="22"/>
-                <w:szCs w:val="22"/>
-              </w:rPr>
-              <w:t>.0</w:t>
+              <w:t>3.0</w:t>
             </w:r>
           </w:p>
         </w:tc>
@@ -2959,17 +3765,7 @@
                 <w:sz w:val="22"/>
                 <w:szCs w:val="22"/>
               </w:rPr>
-              <w:t>18</w:t>
-            </w:r>
-            <w:r>
-              <w:rPr>
-                <w:rFonts w:ascii="Calibri" w:hAnsi="Calibri" w:cs="Calibri"/>
-                <w:color w:val="000000"/>
-                <w:kern w:val="0"/>
-                <w:sz w:val="22"/>
-                <w:szCs w:val="22"/>
-              </w:rPr>
-              <w:t>.0</w:t>
+              <w:t>18.0</w:t>
             </w:r>
           </w:p>
         </w:tc>
@@ -3115,17 +3911,7 @@
                 <w:sz w:val="22"/>
                 <w:szCs w:val="22"/>
               </w:rPr>
-              <w:t>7</w:t>
-            </w:r>
-            <w:r>
-              <w:rPr>
-                <w:rFonts w:ascii="Calibri" w:hAnsi="Calibri" w:cs="Calibri"/>
-                <w:color w:val="000000"/>
-                <w:kern w:val="0"/>
-                <w:sz w:val="22"/>
-                <w:szCs w:val="22"/>
-              </w:rPr>
-              <w:t>.0</w:t>
+              <w:t>7.0</w:t>
             </w:r>
           </w:p>
         </w:tc>
@@ -3211,17 +3997,7 @@
                 <w:sz w:val="22"/>
                 <w:szCs w:val="22"/>
               </w:rPr>
-              <w:t>19</w:t>
-            </w:r>
-            <w:r>
-              <w:rPr>
-                <w:rFonts w:ascii="Calibri" w:hAnsi="Calibri" w:cs="Calibri"/>
-                <w:color w:val="000000"/>
-                <w:kern w:val="0"/>
-                <w:sz w:val="22"/>
-                <w:szCs w:val="22"/>
-              </w:rPr>
-              <w:t>.0</w:t>
+              <w:t>19.0</w:t>
             </w:r>
           </w:p>
         </w:tc>
@@ -3294,6 +4070,48 @@
           <w:bCs/>
         </w:rPr>
       </w:pPr>
+      <w:r>
+        <w:rPr>
+          <w:b/>
+          <w:bCs/>
+        </w:rPr>
+        <w:t>Figure</w:t>
+      </w:r>
+      <w:r>
+        <w:rPr>
+          <w:b/>
+          <w:bCs/>
+        </w:rPr>
+        <w:t xml:space="preserve"> </w:t>
+      </w:r>
+      <w:r>
+        <w:rPr>
+          <w:b/>
+          <w:bCs/>
+        </w:rPr>
+        <w:t>2</w:t>
+      </w:r>
+      <w:r>
+        <w:rPr>
+          <w:b/>
+          <w:bCs/>
+        </w:rPr>
+        <w:t>.</w:t>
+      </w:r>
+      <w:r>
+        <w:rPr>
+          <w:b/>
+          <w:bCs/>
+        </w:rPr>
+        <w:t xml:space="preserve"> Tree Canopy Coverage by Philadelphia City Council District, 20xx</w:t>
+      </w:r>
+      <w:r>
+        <w:rPr>
+          <w:b/>
+          <w:bCs/>
+        </w:rPr>
+        <w:t xml:space="preserve"> </w:t>
+      </w:r>
     </w:p>
     <w:p>
       <w:pPr>
@@ -3306,6 +4124,7 @@
         <w:rPr>
           <w:b/>
           <w:bCs/>
+          <w:noProof/>
         </w:rPr>
         <w:lastRenderedPageBreak/>
         <w:drawing>
@@ -3324,7 +4143,7 @@
                     <pic:cNvPicPr/>
                   </pic:nvPicPr>
                   <pic:blipFill>
-                    <a:blip r:embed="rId8"/>
+                    <a:blip r:embed="rId20"/>
                     <a:stretch>
                       <a:fillRect/>
                     </a:stretch>
@@ -3354,6 +4173,7 @@
         <w:rPr>
           <w:b/>
           <w:bCs/>
+          <w:noProof/>
         </w:rPr>
         <w:drawing>
           <wp:inline distT="0" distB="0" distL="0" distR="0" wp14:anchorId="4E436BD6" wp14:editId="787E7736">
@@ -3371,7 +4191,7 @@
                     <pic:cNvPicPr/>
                   </pic:nvPicPr>
                   <pic:blipFill>
-                    <a:blip r:embed="rId9"/>
+                    <a:blip r:embed="rId21"/>
                     <a:stretch>
                       <a:fillRect/>
                     </a:stretch>
@@ -3417,7 +4237,13 @@
     </w:p>
     <w:p>
       <w:r>
-        <w:t xml:space="preserve">Calculating and presenting tee canopy coverage and health insurance coverage by council district reveals </w:t>
+        <w:t>Calculating and presenting t</w:t>
+      </w:r>
+      <w:r>
+        <w:t>r</w:t>
+      </w:r>
+      <w:r>
+        <w:t xml:space="preserve">ee canopy coverage and health insurance coverage by council district reveals </w:t>
       </w:r>
       <w:r>
         <w:t>distinct disparities both across and within districts. Tree canopy coverage varies from the least dense district</w:t>
@@ -3498,10 +4324,7 @@
         <w:t xml:space="preserve"> of </w:t>
       </w:r>
       <w:r>
-        <w:t>Wissahickon Valley Par</w:t>
-      </w:r>
-      <w:r>
-        <w:t>k</w:t>
+        <w:t>Wissahickon Valley Park</w:t>
       </w:r>
       <w:r>
         <w:t xml:space="preserve">, which is a </w:t>
@@ -3516,31 +4339,147 @@
         <w:t xml:space="preserve"> </w:t>
       </w:r>
       <w:r>
-        <w:t>. However, outside of those that contain parks, there are districts with higher coverage. For example, district 3</w:t>
+        <w:t xml:space="preserve">. However, outside of those that contain parks, there </w:t>
+      </w:r>
+      <w:r>
+        <w:t>is still variation across districts</w:t>
+      </w:r>
+      <w:r>
+        <w:t>. For example, district 3</w:t>
       </w:r>
       <w:r>
         <w:t>, which does not contain any major parks has</w:t>
       </w:r>
       <w:r>
-        <w:t xml:space="preserve"> 8% coverage. Tree canopy coverage is of high public health importance as trees can both mitigate some of the effects of high temperatures as well as being associated with XX, XX (add in some social outcomes).</w:t>
-      </w:r>
-      <w:r>
-        <w:t xml:space="preserve"> Tree canopy coverage is important for city council members to understand as they can have influence over resources to mitigate health effects of heat – for example resources for cooling centers, tree planting, etc. (CITE). </w:t>
+        <w:t xml:space="preserve"> 8% coverage</w:t>
+      </w:r>
+      <w:r>
+        <w:t xml:space="preserve"> while di</w:t>
+      </w:r>
+      <w:r>
+        <w:t>strict 5 has 4.9%</w:t>
+      </w:r>
+      <w:r>
+        <w:t xml:space="preserve">. Tree canopy coverage is of high public health importance as trees can both mitigate some of the effects of high temperatures as well as being associated with </w:t>
+      </w:r>
+      <w:r>
+        <w:t xml:space="preserve">other health measures including </w:t>
+      </w:r>
+      <w:r>
+        <w:t>lower odds of gun violence (</w:t>
+      </w:r>
+      <w:hyperlink r:id="rId22" w:history="1">
+        <w:r>
+          <w:rPr>
+            <w:rStyle w:val="Hyperlink"/>
+          </w:rPr>
+          <w:t>https://pmc.ncbi.nlm.nih.gov/articles/PMC5860224/</w:t>
+        </w:r>
+      </w:hyperlink>
+      <w:r>
+        <w:t xml:space="preserve">) </w:t>
+      </w:r>
+      <w:r>
+        <w:t xml:space="preserve">, </w:t>
+      </w:r>
+      <w:r>
+        <w:t>lower premature mortality (</w:t>
+      </w:r>
+      <w:hyperlink r:id="rId23" w:history="1">
+        <w:r>
+          <w:rPr>
+            <w:rStyle w:val="Hyperlink"/>
+          </w:rPr>
+          <w:t>https://www.thelancet.com/journals/lanplh/article/PIIS2542-5196(20)30058-9/fulltext</w:t>
+        </w:r>
+      </w:hyperlink>
+      <w:r>
+        <w:t xml:space="preserve">) </w:t>
+      </w:r>
+      <w:r>
+        <w:t>and improved mental health(</w:t>
+      </w:r>
+      <w:hyperlink r:id="rId24" w:history="1">
+        <w:r>
+          <w:rPr>
+            <w:rStyle w:val="Hyperlink"/>
+          </w:rPr>
+          <w:t>https://www.sciencedirect.com/science/article/pii/S1618866716301182</w:t>
+        </w:r>
+      </w:hyperlink>
+      <w:r>
+        <w:t>)</w:t>
+      </w:r>
+      <w:r>
+        <w:t>.</w:t>
+      </w:r>
+      <w:r>
+        <w:t xml:space="preserve"> Tree canopy coverage is important for city council members to understand as they can have influence over resources to mitigate health effects of he</w:t>
+      </w:r>
+      <w:commentRangeStart w:id="10"/>
+      <w:r>
+        <w:t>at – for example resources for cooling centers, tree planting</w:t>
+      </w:r>
+      <w:r>
+        <w:t xml:space="preserve">, and </w:t>
+      </w:r>
+      <w:r>
+        <w:t xml:space="preserve">home improvements. </w:t>
+      </w:r>
+      <w:r>
+        <w:t xml:space="preserve"> </w:t>
+      </w:r>
+      <w:commentRangeEnd w:id="10"/>
+      <w:r>
+        <w:rPr>
+          <w:rStyle w:val="CommentReference"/>
+          <w:sz w:val="24"/>
+          <w:szCs w:val="24"/>
+        </w:rPr>
+        <w:commentReference w:id="10"/>
       </w:r>
     </w:p>
     <w:p/>
     <w:p>
       <w:r>
-        <w:t xml:space="preserve">Health insurance </w:t>
-      </w:r>
-      <w:r>
-        <w:t xml:space="preserve">is distributed differently across Philadelphia. The district with the lowest percent of residents lacking coverage was district 4, the same district with high tree canopy coverage, but the district with the highest percentage of residents lacking health insurance was </w:t>
+        <w:t>Not all Philadelphia residents have health insurance.</w:t>
+      </w:r>
+      <w:r>
+        <w:t xml:space="preserve"> The district with the lowest percent of residents lacking coverage was district 4, the same district with high tree canopy coverage, but the district with the highest percentage of residents lacking health insurance was </w:t>
       </w:r>
       <w:r>
         <w:t>d</w:t>
       </w:r>
       <w:r>
-        <w:t>istrict 7. District 7 is also the district with the highest percentage of Hispanic residents, which may contribute to the high percentage of people without health insurance if some residents are undocumented and therefor ineligible for public health insurance. Hispanic people make up the largest ethnicity of undocumented people in the US currently</w:t>
+        <w:t xml:space="preserve">istrict 7. District 7 is also the district with the highest percentage of </w:t>
+      </w:r>
+      <w:commentRangeStart w:id="11"/>
+      <w:commentRangeStart w:id="12"/>
+      <w:r>
+        <w:t xml:space="preserve">Hispanic residents, which may contribute to the high percentage of people without health insurance if some </w:t>
+      </w:r>
+      <w:r>
+        <w:lastRenderedPageBreak/>
+        <w:t>residents are undocumented and therefor ineligible for public health insurance.</w:t>
+      </w:r>
+      <w:commentRangeEnd w:id="11"/>
+      <w:r>
+        <w:rPr>
+          <w:rStyle w:val="CommentReference"/>
+          <w:sz w:val="24"/>
+          <w:szCs w:val="24"/>
+        </w:rPr>
+        <w:commentReference w:id="11"/>
+      </w:r>
+      <w:commentRangeEnd w:id="12"/>
+      <w:r>
+        <w:rPr>
+          <w:rStyle w:val="CommentReference"/>
+        </w:rPr>
+        <w:commentReference w:id="12"/>
+      </w:r>
+      <w:r>
+        <w:t xml:space="preserve"> Hispanic people make up the largest ethnicity of undocumented people in the US currently</w:t>
       </w:r>
       <w:r>
         <w:t xml:space="preserve"> (cite)</w:t>
@@ -3564,11 +4503,7 @@
         <w:t xml:space="preserve"> (? Cite)</w:t>
       </w:r>
       <w:r>
-        <w:t xml:space="preserve">, or </w:t>
-      </w:r>
-      <w:r>
-        <w:lastRenderedPageBreak/>
-        <w:t xml:space="preserve">push state lawmakers to </w:t>
+        <w:t xml:space="preserve">, or push state lawmakers to </w:t>
       </w:r>
       <w:r>
         <w:t>create a public health insurance option for undocumented residents (</w:t>
@@ -3580,7 +4515,6 @@
         <w:t xml:space="preserve">is this true?) </w:t>
       </w:r>
     </w:p>
-    <w:p/>
     <w:p>
       <w:r>
         <w:t xml:space="preserve">Understanding both the </w:t>
@@ -3612,15 +4546,35 @@
         <w:t xml:space="preserve"> for their own (or their political parties) benefit, can lead to districts with higher internal </w:t>
       </w:r>
       <w:r>
-        <w:t xml:space="preserve">and or between district variation (cite tamara and </w:t>
-      </w:r>
-      <w:proofErr w:type="spellStart"/>
-      <w:r>
-        <w:t>alinas</w:t>
-      </w:r>
-      <w:proofErr w:type="spellEnd"/>
-      <w:r>
-        <w:t xml:space="preserve"> papers).  </w:t>
+        <w:t>and or between district variation (</w:t>
+      </w:r>
+      <w:hyperlink r:id="rId25" w:history="1">
+        <w:r>
+          <w:rPr>
+            <w:rStyle w:val="Hyperlink"/>
+          </w:rPr>
+          <w:t>https://pubmed.ncbi.nlm.nih.gov/39190647/</w:t>
+        </w:r>
+      </w:hyperlink>
+      <w:r>
+        <w:t xml:space="preserve"> </w:t>
+      </w:r>
+      <w:r>
+        <w:t xml:space="preserve">and </w:t>
+      </w:r>
+      <w:hyperlink r:id="rId26" w:history="1">
+        <w:r>
+          <w:rPr>
+            <w:rStyle w:val="Hyperlink"/>
+          </w:rPr>
+          <w:t>https://bmcpublichealth.biomedcentral.com/articles/10.1186/s12889-025-22221-5</w:t>
+        </w:r>
+      </w:hyperlink>
+      <w:r>
+        <w:t>).</w:t>
+      </w:r>
+      <w:r>
+        <w:t xml:space="preserve"> </w:t>
       </w:r>
       <w:r>
         <w:t xml:space="preserve">Understanding the underlying distribution of </w:t>
@@ -3682,6 +4636,18 @@
       </w:r>
       <w:r>
         <w:t xml:space="preserve">geographies. </w:t>
+      </w:r>
+      <w:r>
+        <w:t xml:space="preserve">This </w:t>
+      </w:r>
+      <w:r>
+        <w:t>analysis</w:t>
+      </w:r>
+      <w:r>
+        <w:t xml:space="preserve"> focused on Philadelphia, but health metrics </w:t>
+      </w:r>
+      <w:r>
+        <w:t xml:space="preserve">can be calculated using the same methodology for other jurisdictions. Doing so helps politicians, residents, and advocates better understand the health of their neighborhood and city. </w:t>
       </w:r>
     </w:p>
     <w:sectPr>
@@ -3692,6 +4658,258 @@
     </w:sectPr>
   </w:body>
 </w:document>
+</file>
+
+<file path=word/comments.xml><?xml version="1.0" encoding="utf-8"?>
+<w:comments xmlns:wpc="http://schemas.microsoft.com/office/word/2010/wordprocessingCanvas" xmlns:cx="http://schemas.microsoft.com/office/drawing/2014/chartex" xmlns:cx1="http://schemas.microsoft.com/office/drawing/2015/9/8/chartex" xmlns:cx2="http://schemas.microsoft.com/office/drawing/2015/10/21/chartex" xmlns:cx3="http://schemas.microsoft.com/office/drawing/2016/5/9/chartex" xmlns:cx4="http://schemas.microsoft.com/office/drawing/2016/5/10/chartex" xmlns:cx5="http://schemas.microsoft.com/office/drawing/2016/5/11/chartex" xmlns:cx6="http://schemas.microsoft.com/office/drawing/2016/5/12/chartex" xmlns:cx7="http://schemas.microsoft.com/office/drawing/2016/5/13/chartex" xmlns:cx8="http://schemas.microsoft.com/office/drawing/2016/5/14/chartex" xmlns:mc="http://schemas.openxmlformats.org/markup-compatibility/2006" xmlns:aink="http://schemas.microsoft.com/office/drawing/2016/ink" xmlns:am3d="http://schemas.microsoft.com/office/drawing/2017/model3d" xmlns:o="urn:schemas-microsoft-com:office:office" xmlns:oel="http://schemas.microsoft.com/office/2019/extlst" xmlns:r="http://schemas.openxmlformats.org/officeDocument/2006/relationships" xmlns:m="http://schemas.openxmlformats.org/officeDocument/2006/math" xmlns:v="urn:schemas-microsoft-com:vml" xmlns:wp14="http://schemas.microsoft.com/office/word/2010/wordprocessingDrawing" xmlns:wp="http://schemas.openxmlformats.org/drawingml/2006/wordprocessingDrawing" xmlns:w10="urn:schemas-microsoft-com:office:word" xmlns:w="http://schemas.openxmlformats.org/wordprocessingml/2006/main" xmlns:w14="http://schemas.microsoft.com/office/word/2010/wordml" xmlns:w15="http://schemas.microsoft.com/office/word/2012/wordml" xmlns:w16cex="http://schemas.microsoft.com/office/word/2018/wordml/cex" xmlns:w16cid="http://schemas.microsoft.com/office/word/2016/wordml/cid" xmlns:w16="http://schemas.microsoft.com/office/word/2018/wordml" xmlns:w16du="http://schemas.microsoft.com/office/word/2023/wordml/word16du" xmlns:w16sdtdh="http://schemas.microsoft.com/office/word/2020/wordml/sdtdatahash" xmlns:w16sdtfl="http://schemas.microsoft.com/office/word/2024/wordml/sdtformatlock" xmlns:w16se="http://schemas.microsoft.com/office/word/2015/wordml/symex" xmlns:wpg="http://schemas.microsoft.com/office/word/2010/wordprocessingGroup" xmlns:wpi="http://schemas.microsoft.com/office/word/2010/wordprocessingInk" xmlns:wne="http://schemas.microsoft.com/office/word/2006/wordml" xmlns:wps="http://schemas.microsoft.com/office/word/2010/wordprocessingShape" mc:Ignorable="w14 w15 w16se w16cid w16 w16cex w16sdtdh w16sdtfl w16du wp14">
+  <w:comment w:id="0" w:author="Schnake-Mahl,Alina" w:date="2025-07-15T12:26:00Z" w:initials="Sc">
+    <w:p>
+      <w:r>
+        <w:annotationRef/>
+      </w:r>
+      <w:r>
+        <w:t>can cite this article https://pubmed.ncbi.nlm.nih.gov/36274459/</w:t>
+      </w:r>
+    </w:p>
+  </w:comment>
+  <w:comment w:id="1" w:author="Schnake-Mahl,Alina" w:date="2025-07-15T12:55:00Z" w:initials="Sc">
+    <w:p>
+      <w:pPr>
+        <w:pStyle w:val="CommentText"/>
+      </w:pPr>
+      <w:r>
+        <w:rPr>
+          <w:rStyle w:val="CommentReference"/>
+        </w:rPr>
+        <w:annotationRef/>
+      </w:r>
+      <w:r>
+        <w:t xml:space="preserve"> also worth trying to really frame in the urban here (if going for j urban healht?). importance of cities for health- but thinking about not just city wide but also variation within cities and predictors of differences/disparities within cities? </w:t>
+      </w:r>
+    </w:p>
+  </w:comment>
+  <w:comment w:id="2" w:author="Rushovich,Tamara" w:date="2025-08-01T09:43:00Z" w:initials="R">
+    <w:p>
+      <w:r>
+        <w:rPr>
+          <w:rStyle w:val="CommentReference"/>
+        </w:rPr>
+        <w:annotationRef/>
+      </w:r>
+      <w:r>
+        <w:rPr>
+          <w:sz w:val="20"/>
+          <w:szCs w:val="20"/>
+        </w:rPr>
+        <w:t xml:space="preserve">Alina: also worth trying to really frame in the urban here (if going for j urban healht?). importance of cities for health- but thinking about not just city wide but also variation within cities and predictors of differences/disparities within cities? </w:t>
+      </w:r>
+    </w:p>
+  </w:comment>
+  <w:comment w:id="3" w:author="Schnake-Mahl,Alina" w:date="2025-07-15T12:54:00Z" w:initials="Sc">
+    <w:p>
+      <w:pPr>
+        <w:pStyle w:val="CommentText"/>
+      </w:pPr>
+      <w:r>
+        <w:rPr>
+          <w:rStyle w:val="CommentReference"/>
+        </w:rPr>
+        <w:annotationRef/>
+      </w:r>
+      <w:r>
+        <w:t>maybe opportunity to go a bit further on specifics of coucil members powers? either here on in conclusion-- can talk about specifics of philly and then more generalizable? e.g. philly has coucil member deference around local development and zoning (though a norm not a rule). And maybe also generally about how different cities haev different political strucutres- e.g. strong coucil, strong mayor etc.. and future work to understand impacts on health ?</w:t>
+      </w:r>
+    </w:p>
+  </w:comment>
+  <w:comment w:id="4" w:author="Schnake-Mahl,Alina" w:date="2025-07-15T12:28:00Z" w:initials="Sc">
+    <w:p>
+      <w:r>
+        <w:annotationRef/>
+      </w:r>
+      <w:r>
+        <w:t xml:space="preserve">I think we need some sort of a statement about the generalizabiity of this outside of pihlly. e.g. case study to demonstratte xyz. </w:t>
+      </w:r>
+    </w:p>
+  </w:comment>
+  <w:comment w:id="5" w:author="Schnake-Mahl,Alina" w:date="2025-07-15T12:58:00Z" w:initials="Sc">
+    <w:p>
+      <w:pPr>
+        <w:pStyle w:val="CommentText"/>
+      </w:pPr>
+      <w:r>
+        <w:rPr>
+          <w:rStyle w:val="CommentReference"/>
+        </w:rPr>
+        <w:annotationRef/>
+      </w:r>
+      <w:r>
+        <w:t>can we switch to active tense?</w:t>
+      </w:r>
+    </w:p>
+  </w:comment>
+  <w:comment w:id="6" w:author="Schnake-Mahl,Alina" w:date="2025-07-15T12:57:00Z" w:initials="Sc">
+    <w:p>
+      <w:pPr>
+        <w:pStyle w:val="CommentText"/>
+      </w:pPr>
+      <w:r>
+        <w:rPr>
+          <w:rStyle w:val="CommentReference"/>
+        </w:rPr>
+        <w:annotationRef/>
+      </w:r>
+      <w:r>
+        <w:t xml:space="preserve">Need to add somting about the boundaries we used and when they changed. (to give a little insight into that district generating process). </w:t>
+      </w:r>
+    </w:p>
+  </w:comment>
+  <w:comment w:id="8" w:author="Schnake-Mahl,Alina" w:date="2025-07-15T13:23:00Z" w:initials="Sc">
+    <w:p>
+      <w:pPr>
+        <w:pStyle w:val="CommentText"/>
+      </w:pPr>
+      <w:r>
+        <w:rPr>
+          <w:rStyle w:val="CommentReference"/>
+        </w:rPr>
+        <w:annotationRef/>
+      </w:r>
+      <w:r>
+        <w:t xml:space="preserve">can we state what that means exactly? 19% of the district was covered by trees? </w:t>
+      </w:r>
+    </w:p>
+  </w:comment>
+  <w:comment w:id="9" w:author="Schnake-Mahl,Alina" w:date="2025-07-15T13:29:00Z" w:initials="Sc">
+    <w:p>
+      <w:pPr>
+        <w:pStyle w:val="CommentText"/>
+      </w:pPr>
+      <w:r>
+        <w:rPr>
+          <w:rStyle w:val="CommentReference"/>
+        </w:rPr>
+        <w:annotationRef/>
+      </w:r>
+      <w:r>
+        <w:t xml:space="preserve">i wonder if we want to add anythinga bout dissemination? liek if we end up distributing to this to council to get feedback? </w:t>
+      </w:r>
+    </w:p>
+  </w:comment>
+  <w:comment w:id="10" w:author="Schnake-Mahl,Alina" w:date="2025-07-15T13:24:00Z" w:initials="Sc">
+    <w:p>
+      <w:pPr>
+        <w:pStyle w:val="CommentText"/>
+      </w:pPr>
+      <w:r>
+        <w:rPr>
+          <w:rStyle w:val="CommentReference"/>
+        </w:rPr>
+        <w:annotationRef/>
+      </w:r>
+      <w:r>
+        <w:t>can also bring in the work by penn folks that found a relationship between tree coverage and  gun violence rates-- https://pmc.ncbi.nlm.nih.gov/articles/PMC5860224/</w:t>
+      </w:r>
+    </w:p>
+  </w:comment>
+  <w:comment w:id="11" w:author="Schnake-Mahl,Alina" w:date="2025-07-15T13:25:00Z" w:initials="Sc">
+    <w:p>
+      <w:pPr>
+        <w:pStyle w:val="CommentText"/>
+      </w:pPr>
+      <w:r>
+        <w:rPr>
+          <w:rStyle w:val="CommentReference"/>
+        </w:rPr>
+        <w:annotationRef/>
+      </w:r>
+      <w:r>
+        <w:t xml:space="preserve">maybe let's check any stats on this before we make this assumption. there's also restrictions for medicaid for example among documented folks-- i think 5 year waiting period. </w:t>
+      </w:r>
+    </w:p>
+  </w:comment>
+  <w:comment w:id="12" w:author="Rushovich,Tamara" w:date="2025-08-01T10:07:00Z" w:initials="R">
+    <w:p>
+      <w:r>
+        <w:rPr>
+          <w:rStyle w:val="CommentReference"/>
+        </w:rPr>
+        <w:annotationRef/>
+      </w:r>
+      <w:hyperlink r:id="rId1" w:history="1">
+        <w:r>
+          <w:rPr>
+            <w:rStyle w:val="Hyperlink"/>
+            <w:sz w:val="20"/>
+            <w:szCs w:val="20"/>
+          </w:rPr>
+          <w:t>https://6abc.com/post/data-investigation-health-inequity-insurance-care/11057753/</w:t>
+        </w:r>
+      </w:hyperlink>
+    </w:p>
+  </w:comment>
+</w:comments>
+</file>
+
+<file path=word/commentsExtended.xml><?xml version="1.0" encoding="utf-8"?>
+<w15:commentsEx xmlns:wpc="http://schemas.microsoft.com/office/word/2010/wordprocessingCanvas" xmlns:cx="http://schemas.microsoft.com/office/drawing/2014/chartex" xmlns:cx1="http://schemas.microsoft.com/office/drawing/2015/9/8/chartex" xmlns:cx2="http://schemas.microsoft.com/office/drawing/2015/10/21/chartex" xmlns:cx3="http://schemas.microsoft.com/office/drawing/2016/5/9/chartex" xmlns:cx4="http://schemas.microsoft.com/office/drawing/2016/5/10/chartex" xmlns:cx5="http://schemas.microsoft.com/office/drawing/2016/5/11/chartex" xmlns:cx6="http://schemas.microsoft.com/office/drawing/2016/5/12/chartex" xmlns:cx7="http://schemas.microsoft.com/office/drawing/2016/5/13/chartex" xmlns:cx8="http://schemas.microsoft.com/office/drawing/2016/5/14/chartex" xmlns:mc="http://schemas.openxmlformats.org/markup-compatibility/2006" xmlns:aink="http://schemas.microsoft.com/office/drawing/2016/ink" xmlns:am3d="http://schemas.microsoft.com/office/drawing/2017/model3d" xmlns:o="urn:schemas-microsoft-com:office:office" xmlns:oel="http://schemas.microsoft.com/office/2019/extlst" xmlns:r="http://schemas.openxmlformats.org/officeDocument/2006/relationships" xmlns:m="http://schemas.openxmlformats.org/officeDocument/2006/math" xmlns:v="urn:schemas-microsoft-com:vml" xmlns:wp14="http://schemas.microsoft.com/office/word/2010/wordprocessingDrawing" xmlns:wp="http://schemas.openxmlformats.org/drawingml/2006/wordprocessingDrawing" xmlns:w10="urn:schemas-microsoft-com:office:word" xmlns:w="http://schemas.openxmlformats.org/wordprocessingml/2006/main" xmlns:w14="http://schemas.microsoft.com/office/word/2010/wordml" xmlns:w15="http://schemas.microsoft.com/office/word/2012/wordml" xmlns:w16cex="http://schemas.microsoft.com/office/word/2018/wordml/cex" xmlns:w16cid="http://schemas.microsoft.com/office/word/2016/wordml/cid" xmlns:w16="http://schemas.microsoft.com/office/word/2018/wordml" xmlns:w16du="http://schemas.microsoft.com/office/word/2023/wordml/word16du" xmlns:w16sdtdh="http://schemas.microsoft.com/office/word/2020/wordml/sdtdatahash" xmlns:w16sdtfl="http://schemas.microsoft.com/office/word/2024/wordml/sdtformatlock" xmlns:w16se="http://schemas.microsoft.com/office/word/2015/wordml/symex" xmlns:wpg="http://schemas.microsoft.com/office/word/2010/wordprocessingGroup" xmlns:wpi="http://schemas.microsoft.com/office/word/2010/wordprocessingInk" xmlns:wne="http://schemas.microsoft.com/office/word/2006/wordml" xmlns:wps="http://schemas.microsoft.com/office/word/2010/wordprocessingShape" mc:Ignorable="w14 w15 w16se w16cid w16 w16cex w16sdtdh w16sdtfl w16du wp14">
+  <w15:commentEx w15:paraId="7DEBC55E" w15:done="1"/>
+  <w15:commentEx w15:paraId="345BAD2A" w15:paraIdParent="7DEBC55E" w15:done="1"/>
+  <w15:commentEx w15:paraId="37A7651E" w15:done="0"/>
+  <w15:commentEx w15:paraId="55746C96" w15:done="0"/>
+  <w15:commentEx w15:paraId="042E22C8" w15:done="1"/>
+  <w15:commentEx w15:paraId="16985B87" w15:done="1"/>
+  <w15:commentEx w15:paraId="7354D488" w15:done="1"/>
+  <w15:commentEx w15:paraId="65967645" w15:done="1"/>
+  <w15:commentEx w15:paraId="0FB1A086" w15:done="0"/>
+  <w15:commentEx w15:paraId="35129B98" w15:done="1"/>
+  <w15:commentEx w15:paraId="39BC327E" w15:done="0"/>
+  <w15:commentEx w15:paraId="46F84FE4" w15:paraIdParent="39BC327E" w15:done="0"/>
+</w15:commentsEx>
+</file>
+
+<file path=word/commentsExtensible.xml><?xml version="1.0" encoding="utf-8"?>
+<w16cex:commentsExtensible xmlns:wpc="http://schemas.microsoft.com/office/word/2010/wordprocessingCanvas" xmlns:cx="http://schemas.microsoft.com/office/drawing/2014/chartex" xmlns:cx1="http://schemas.microsoft.com/office/drawing/2015/9/8/chartex" xmlns:cx2="http://schemas.microsoft.com/office/drawing/2015/10/21/chartex" xmlns:cx3="http://schemas.microsoft.com/office/drawing/2016/5/9/chartex" xmlns:cx4="http://schemas.microsoft.com/office/drawing/2016/5/10/chartex" xmlns:cx5="http://schemas.microsoft.com/office/drawing/2016/5/11/chartex" xmlns:cx6="http://schemas.microsoft.com/office/drawing/2016/5/12/chartex" xmlns:cx7="http://schemas.microsoft.com/office/drawing/2016/5/13/chartex" xmlns:cx8="http://schemas.microsoft.com/office/drawing/2016/5/14/chartex" xmlns:cr="http://schemas.microsoft.com/office/comments/2020/reactions" xmlns:mc="http://schemas.openxmlformats.org/markup-compatibility/2006" xmlns:aink="http://schemas.microsoft.com/office/drawing/2016/ink" xmlns:am3d="http://schemas.microsoft.com/office/drawing/2017/model3d" xmlns:o="urn:schemas-microsoft-com:office:office" xmlns:oel="http://schemas.microsoft.com/office/2019/extlst" xmlns:r="http://schemas.openxmlformats.org/officeDocument/2006/relationships" xmlns:m="http://schemas.openxmlformats.org/officeDocument/2006/math" xmlns:v="urn:schemas-microsoft-com:vml" xmlns:wp14="http://schemas.microsoft.com/office/word/2010/wordprocessingDrawing" xmlns:wp="http://schemas.openxmlformats.org/drawingml/2006/wordprocessingDrawing" xmlns:w10="urn:schemas-microsoft-com:office:word" xmlns:w="http://schemas.openxmlformats.org/wordprocessingml/2006/main" xmlns:w14="http://schemas.microsoft.com/office/word/2010/wordml" xmlns:w15="http://schemas.microsoft.com/office/word/2012/wordml" xmlns:w16cex="http://schemas.microsoft.com/office/word/2018/wordml/cex" xmlns:w16cid="http://schemas.microsoft.com/office/word/2016/wordml/cid" xmlns:w16="http://schemas.microsoft.com/office/word/2018/wordml" xmlns:w16du="http://schemas.microsoft.com/office/word/2023/wordml/word16du" xmlns:w16sdtdh="http://schemas.microsoft.com/office/word/2020/wordml/sdtdatahash" xmlns:w16sdtfl="http://schemas.microsoft.com/office/word/2024/wordml/sdtformatlock" xmlns:w16se="http://schemas.microsoft.com/office/word/2015/wordml/symex" xmlns:wpg="http://schemas.microsoft.com/office/word/2010/wordprocessingGroup" xmlns:wpi="http://schemas.microsoft.com/office/word/2010/wordprocessingInk" xmlns:wne="http://schemas.microsoft.com/office/word/2006/wordml" xmlns:wps="http://schemas.microsoft.com/office/word/2010/wordprocessingShape" mc:Ignorable="w14 w15 w16se w16cid w16 w16cex w16sdtdh w16sdtfl cr w16du wp14">
+  <w16cex:commentExtensible w16cex:durableId="4885BC2D" w16cex:dateUtc="2025-07-15T16:26:00Z"/>
+  <w16cex:commentExtensible w16cex:durableId="2A12B652" w16cex:dateUtc="2025-07-15T16:55:00Z"/>
+  <w16cex:commentExtensible w16cex:durableId="4298F470" w16cex:dateUtc="2025-08-01T13:43:00Z"/>
+  <w16cex:commentExtensible w16cex:durableId="5E93C086" w16cex:dateUtc="2025-07-15T16:54:00Z"/>
+  <w16cex:commentExtensible w16cex:durableId="5B7AB9EF" w16cex:dateUtc="2025-07-15T16:28:00Z"/>
+  <w16cex:commentExtensible w16cex:durableId="32F9DDC7" w16cex:dateUtc="2025-07-15T16:58:00Z"/>
+  <w16cex:commentExtensible w16cex:durableId="39A13692" w16cex:dateUtc="2025-07-15T16:57:00Z"/>
+  <w16cex:commentExtensible w16cex:durableId="0E3810CF" w16cex:dateUtc="2025-07-15T17:23:00Z"/>
+  <w16cex:commentExtensible w16cex:durableId="2C0E2C24" w16cex:dateUtc="2025-07-15T17:29:00Z"/>
+  <w16cex:commentExtensible w16cex:durableId="3E49B653" w16cex:dateUtc="2025-07-15T17:24:00Z"/>
+  <w16cex:commentExtensible w16cex:durableId="49846E92" w16cex:dateUtc="2025-07-15T17:25:00Z"/>
+  <w16cex:commentExtensible w16cex:durableId="4D538522" w16cex:dateUtc="2025-08-01T14:07:00Z"/>
+</w16cex:commentsExtensible>
+</file>
+
+<file path=word/commentsIds.xml><?xml version="1.0" encoding="utf-8"?>
+<w16cid:commentsIds xmlns:wpc="http://schemas.microsoft.com/office/word/2010/wordprocessingCanvas" xmlns:cx="http://schemas.microsoft.com/office/drawing/2014/chartex" xmlns:cx1="http://schemas.microsoft.com/office/drawing/2015/9/8/chartex" xmlns:cx2="http://schemas.microsoft.com/office/drawing/2015/10/21/chartex" xmlns:cx3="http://schemas.microsoft.com/office/drawing/2016/5/9/chartex" xmlns:cx4="http://schemas.microsoft.com/office/drawing/2016/5/10/chartex" xmlns:cx5="http://schemas.microsoft.com/office/drawing/2016/5/11/chartex" xmlns:cx6="http://schemas.microsoft.com/office/drawing/2016/5/12/chartex" xmlns:cx7="http://schemas.microsoft.com/office/drawing/2016/5/13/chartex" xmlns:cx8="http://schemas.microsoft.com/office/drawing/2016/5/14/chartex" xmlns:mc="http://schemas.openxmlformats.org/markup-compatibility/2006" xmlns:aink="http://schemas.microsoft.com/office/drawing/2016/ink" xmlns:am3d="http://schemas.microsoft.com/office/drawing/2017/model3d" xmlns:o="urn:schemas-microsoft-com:office:office" xmlns:oel="http://schemas.microsoft.com/office/2019/extlst" xmlns:r="http://schemas.openxmlformats.org/officeDocument/2006/relationships" xmlns:m="http://schemas.openxmlformats.org/officeDocument/2006/math" xmlns:v="urn:schemas-microsoft-com:vml" xmlns:wp14="http://schemas.microsoft.com/office/word/2010/wordprocessingDrawing" xmlns:wp="http://schemas.openxmlformats.org/drawingml/2006/wordprocessingDrawing" xmlns:w10="urn:schemas-microsoft-com:office:word" xmlns:w="http://schemas.openxmlformats.org/wordprocessingml/2006/main" xmlns:w14="http://schemas.microsoft.com/office/word/2010/wordml" xmlns:w15="http://schemas.microsoft.com/office/word/2012/wordml" xmlns:w16cex="http://schemas.microsoft.com/office/word/2018/wordml/cex" xmlns:w16cid="http://schemas.microsoft.com/office/word/2016/wordml/cid" xmlns:w16="http://schemas.microsoft.com/office/word/2018/wordml" xmlns:w16du="http://schemas.microsoft.com/office/word/2023/wordml/word16du" xmlns:w16sdtdh="http://schemas.microsoft.com/office/word/2020/wordml/sdtdatahash" xmlns:w16sdtfl="http://schemas.microsoft.com/office/word/2024/wordml/sdtformatlock" xmlns:w16se="http://schemas.microsoft.com/office/word/2015/wordml/symex" xmlns:wpg="http://schemas.microsoft.com/office/word/2010/wordprocessingGroup" xmlns:wpi="http://schemas.microsoft.com/office/word/2010/wordprocessingInk" xmlns:wne="http://schemas.microsoft.com/office/word/2006/wordml" xmlns:wps="http://schemas.microsoft.com/office/word/2010/wordprocessingShape" mc:Ignorable="w14 w15 w16se w16cid w16 w16cex w16sdtdh w16sdtfl w16du wp14">
+  <w16cid:commentId w16cid:paraId="7DEBC55E" w16cid:durableId="4885BC2D"/>
+  <w16cid:commentId w16cid:paraId="345BAD2A" w16cid:durableId="2A12B652"/>
+  <w16cid:commentId w16cid:paraId="37A7651E" w16cid:durableId="4298F470"/>
+  <w16cid:commentId w16cid:paraId="55746C96" w16cid:durableId="5E93C086"/>
+  <w16cid:commentId w16cid:paraId="042E22C8" w16cid:durableId="5B7AB9EF"/>
+  <w16cid:commentId w16cid:paraId="16985B87" w16cid:durableId="32F9DDC7"/>
+  <w16cid:commentId w16cid:paraId="7354D488" w16cid:durableId="39A13692"/>
+  <w16cid:commentId w16cid:paraId="65967645" w16cid:durableId="0E3810CF"/>
+  <w16cid:commentId w16cid:paraId="0FB1A086" w16cid:durableId="2C0E2C24"/>
+  <w16cid:commentId w16cid:paraId="35129B98" w16cid:durableId="3E49B653"/>
+  <w16cid:commentId w16cid:paraId="39BC327E" w16cid:durableId="49846E92"/>
+  <w16cid:commentId w16cid:paraId="46F84FE4" w16cid:durableId="4D538522"/>
+</w16cid:commentsIds>
+</file>
+
+<file path=word/people.xml><?xml version="1.0" encoding="utf-8"?>
+<w15:people xmlns:wpc="http://schemas.microsoft.com/office/word/2010/wordprocessingCanvas" xmlns:cx="http://schemas.microsoft.com/office/drawing/2014/chartex" xmlns:cx1="http://schemas.microsoft.com/office/drawing/2015/9/8/chartex" xmlns:cx2="http://schemas.microsoft.com/office/drawing/2015/10/21/chartex" xmlns:cx3="http://schemas.microsoft.com/office/drawing/2016/5/9/chartex" xmlns:cx4="http://schemas.microsoft.com/office/drawing/2016/5/10/chartex" xmlns:cx5="http://schemas.microsoft.com/office/drawing/2016/5/11/chartex" xmlns:cx6="http://schemas.microsoft.com/office/drawing/2016/5/12/chartex" xmlns:cx7="http://schemas.microsoft.com/office/drawing/2016/5/13/chartex" xmlns:cx8="http://schemas.microsoft.com/office/drawing/2016/5/14/chartex" xmlns:mc="http://schemas.openxmlformats.org/markup-compatibility/2006" xmlns:aink="http://schemas.microsoft.com/office/drawing/2016/ink" xmlns:am3d="http://schemas.microsoft.com/office/drawing/2017/model3d" xmlns:o="urn:schemas-microsoft-com:office:office" xmlns:oel="http://schemas.microsoft.com/office/2019/extlst" xmlns:r="http://schemas.openxmlformats.org/officeDocument/2006/relationships" xmlns:m="http://schemas.openxmlformats.org/officeDocument/2006/math" xmlns:v="urn:schemas-microsoft-com:vml" xmlns:wp14="http://schemas.microsoft.com/office/word/2010/wordprocessingDrawing" xmlns:wp="http://schemas.openxmlformats.org/drawingml/2006/wordprocessingDrawing" xmlns:w10="urn:schemas-microsoft-com:office:word" xmlns:w="http://schemas.openxmlformats.org/wordprocessingml/2006/main" xmlns:w14="http://schemas.microsoft.com/office/word/2010/wordml" xmlns:w15="http://schemas.microsoft.com/office/word/2012/wordml" xmlns:w16cex="http://schemas.microsoft.com/office/word/2018/wordml/cex" xmlns:w16cid="http://schemas.microsoft.com/office/word/2016/wordml/cid" xmlns:w16="http://schemas.microsoft.com/office/word/2018/wordml" xmlns:w16du="http://schemas.microsoft.com/office/word/2023/wordml/word16du" xmlns:w16sdtdh="http://schemas.microsoft.com/office/word/2020/wordml/sdtdatahash" xmlns:w16sdtfl="http://schemas.microsoft.com/office/word/2024/wordml/sdtformatlock" xmlns:w16se="http://schemas.microsoft.com/office/word/2015/wordml/symex" xmlns:wpg="http://schemas.microsoft.com/office/word/2010/wordprocessingGroup" xmlns:wpi="http://schemas.microsoft.com/office/word/2010/wordprocessingInk" xmlns:wne="http://schemas.microsoft.com/office/word/2006/wordml" xmlns:wps="http://schemas.microsoft.com/office/word/2010/wordprocessingShape" mc:Ignorable="w14 w15 w16se w16cid w16 w16cex w16sdtdh w16sdtfl w16du wp14">
+  <w15:person w15:author="Schnake-Mahl,Alina">
+    <w15:presenceInfo w15:providerId="AD" w15:userId="S::as5494@drexel.edu::bf334678-cb8f-4bd7-809d-a20efc2104af"/>
+  </w15:person>
+  <w15:person w15:author="Rushovich,Tamara">
+    <w15:presenceInfo w15:providerId="AD" w15:userId="S::tr842@drexel.edu::6ea65111-83b9-4405-a835-9ee949ba0981"/>
+  </w15:person>
+</w15:people>
 </file>
 
 <file path=word/styles.xml><?xml version="1.0" encoding="utf-8"?>
@@ -4665,6 +5883,71 @@
       </w:tblBorders>
     </w:tblPr>
   </w:style>
+  <w:style w:type="paragraph" w:styleId="CommentText">
+    <w:name w:val="annotation text"/>
+    <w:basedOn w:val="Normal"/>
+    <w:link w:val="CommentTextChar"/>
+    <w:uiPriority w:val="99"/>
+    <w:semiHidden/>
+    <w:unhideWhenUsed/>
+    <w:pPr>
+      <w:spacing w:line="240" w:lineRule="auto"/>
+    </w:pPr>
+    <w:rPr>
+      <w:sz w:val="20"/>
+      <w:szCs w:val="20"/>
+    </w:rPr>
+  </w:style>
+  <w:style w:type="character" w:customStyle="1" w:styleId="CommentTextChar">
+    <w:name w:val="Comment Text Char"/>
+    <w:basedOn w:val="DefaultParagraphFont"/>
+    <w:link w:val="CommentText"/>
+    <w:uiPriority w:val="99"/>
+    <w:semiHidden/>
+    <w:rPr>
+      <w:sz w:val="20"/>
+      <w:szCs w:val="20"/>
+    </w:rPr>
+  </w:style>
+  <w:style w:type="character" w:styleId="CommentReference">
+    <w:name w:val="annotation reference"/>
+    <w:basedOn w:val="DefaultParagraphFont"/>
+    <w:uiPriority w:val="99"/>
+    <w:semiHidden/>
+    <w:unhideWhenUsed/>
+    <w:rPr>
+      <w:sz w:val="16"/>
+      <w:szCs w:val="16"/>
+    </w:rPr>
+  </w:style>
+  <w:style w:type="paragraph" w:styleId="CommentSubject">
+    <w:name w:val="annotation subject"/>
+    <w:basedOn w:val="CommentText"/>
+    <w:next w:val="CommentText"/>
+    <w:link w:val="CommentSubjectChar"/>
+    <w:uiPriority w:val="99"/>
+    <w:semiHidden/>
+    <w:unhideWhenUsed/>
+    <w:rsid w:val="00391F9F"/>
+    <w:rPr>
+      <w:b/>
+      <w:bCs/>
+    </w:rPr>
+  </w:style>
+  <w:style w:type="character" w:customStyle="1" w:styleId="CommentSubjectChar">
+    <w:name w:val="Comment Subject Char"/>
+    <w:basedOn w:val="CommentTextChar"/>
+    <w:link w:val="CommentSubject"/>
+    <w:uiPriority w:val="99"/>
+    <w:semiHidden/>
+    <w:rsid w:val="00391F9F"/>
+    <w:rPr>
+      <w:b/>
+      <w:bCs/>
+      <w:sz w:val="20"/>
+      <w:szCs w:val="20"/>
+    </w:rPr>
+  </w:style>
 </w:styles>
 </file>
 

</xml_diff>